<commit_message>
nmv 20 07 2026
</commit_message>
<xml_diff>
--- a/TS Jatai Ghanam Project/TS 2.6/TS 2.6 Ghanam Sanskrit Corrections.docx
+++ b/TS Jatai Ghanam Project/TS 2.6/TS 2.6 Ghanam Sanskrit Corrections.docx
@@ -112,18 +112,7 @@
           <w:szCs w:val="32"/>
           <w:u w:val="single"/>
         </w:rPr>
-        <w:t xml:space="preserve">Observed </w:t>
-      </w:r>
-      <w:proofErr w:type="gramStart"/>
-      <w:r>
-        <w:rPr>
-          <w:b/>
-          <w:bCs/>
-          <w:sz w:val="32"/>
-          <w:szCs w:val="32"/>
-          <w:u w:val="single"/>
-        </w:rPr>
-        <w:t xml:space="preserve">till </w:t>
+        <w:t xml:space="preserve">Observed till </w:t>
       </w:r>
       <w:r>
         <w:rPr>
@@ -136,7 +125,6 @@
         </w:rPr>
         <w:t>?????</w:t>
       </w:r>
-      <w:proofErr w:type="gramEnd"/>
     </w:p>
     <w:p>
       <w:pPr>
@@ -367,19 +355,8 @@
                 <w:sz w:val="32"/>
                 <w:szCs w:val="40"/>
               </w:rPr>
-              <w:t>)</w:t>
-            </w:r>
-            <w:proofErr w:type="gramStart"/>
-            <w:r>
-              <w:rPr>
-                <w:rFonts w:ascii="BRH Devanagari Extra" w:hAnsi="BRH Devanagari Extra" w:cs="BRH Devanagari Extra"/>
-                <w:color w:val="000000"/>
-                <w:sz w:val="32"/>
-                <w:szCs w:val="40"/>
-              </w:rPr>
-              <w:t>-  AÉ</w:t>
-            </w:r>
-            <w:proofErr w:type="gramEnd"/>
+              <w:t>)-  AÉ</w:t>
+            </w:r>
             <w:r>
               <w:rPr>
                 <w:rFonts w:ascii="BRH Malayalam Extra" w:hAnsi="BRH Malayalam Extra" w:cs="BRH Devanagari Extra"/>
@@ -739,27 +716,7 @@
                 <w:sz w:val="32"/>
                 <w:szCs w:val="40"/>
               </w:rPr>
-              <w:t>)</w:t>
-            </w:r>
-            <w:proofErr w:type="gramStart"/>
-            <w:r>
-              <w:rPr>
-                <w:rFonts w:ascii="BRH Devanagari Extra" w:hAnsi="BRH Devanagari Extra" w:cs="BRH Devanagari Extra"/>
-                <w:color w:val="000000"/>
-                <w:sz w:val="32"/>
-                <w:szCs w:val="40"/>
-              </w:rPr>
-              <w:t>-  rÉiÉç</w:t>
-            </w:r>
-            <w:proofErr w:type="gramEnd"/>
-            <w:r>
-              <w:rPr>
-                <w:rFonts w:ascii="BRH Devanagari Extra" w:hAnsi="BRH Devanagari Extra" w:cs="BRH Devanagari Extra"/>
-                <w:color w:val="000000"/>
-                <w:sz w:val="32"/>
-                <w:szCs w:val="40"/>
-              </w:rPr>
-              <w:t xml:space="preserve"> | oÉëÔ</w:t>
+              <w:t>)-  rÉiÉç | oÉëÔ</w:t>
             </w:r>
             <w:r>
               <w:rPr>
@@ -1106,19 +1063,8 @@
                 <w:sz w:val="32"/>
                 <w:szCs w:val="40"/>
               </w:rPr>
-              <w:t>)</w:t>
-            </w:r>
-            <w:proofErr w:type="gramStart"/>
-            <w:r>
-              <w:rPr>
-                <w:rFonts w:ascii="BRH Devanagari Extra" w:hAnsi="BRH Devanagari Extra" w:cs="BRH Devanagari Extra"/>
-                <w:color w:val="000000"/>
-                <w:sz w:val="32"/>
-                <w:szCs w:val="40"/>
-              </w:rPr>
-              <w:t>-  oÉëÔ</w:t>
-            </w:r>
-            <w:proofErr w:type="gramEnd"/>
+              <w:t>)-  oÉëÔ</w:t>
+            </w:r>
             <w:r>
               <w:rPr>
                 <w:rFonts w:ascii="BRH Malayalam Extra" w:hAnsi="BRH Malayalam Extra" w:cs="BRH Devanagari Extra"/>
@@ -1528,19 +1474,8 @@
                 <w:sz w:val="32"/>
                 <w:szCs w:val="40"/>
               </w:rPr>
-              <w:t>)</w:t>
-            </w:r>
-            <w:proofErr w:type="gramStart"/>
-            <w:r>
-              <w:rPr>
-                <w:rFonts w:ascii="BRH Devanagari Extra" w:hAnsi="BRH Devanagari Extra" w:cs="BRH Devanagari Extra"/>
-                <w:color w:val="000000"/>
-                <w:sz w:val="32"/>
-                <w:szCs w:val="40"/>
-              </w:rPr>
-              <w:t>-  AÉ</w:t>
-            </w:r>
-            <w:proofErr w:type="gramEnd"/>
+              <w:t>)-  AÉ</w:t>
+            </w:r>
             <w:r>
               <w:rPr>
                 <w:rFonts w:ascii="BRH Malayalam Extra" w:hAnsi="BRH Malayalam Extra" w:cs="BRH Devanagari Extra"/>
@@ -1922,27 +1857,7 @@
                 <w:sz w:val="32"/>
                 <w:szCs w:val="40"/>
               </w:rPr>
-              <w:t>)</w:t>
-            </w:r>
-            <w:proofErr w:type="gramStart"/>
-            <w:r>
-              <w:rPr>
-                <w:rFonts w:ascii="BRH Devanagari Extra" w:hAnsi="BRH Devanagari Extra" w:cs="BRH Devanagari Extra"/>
-                <w:color w:val="000000"/>
-                <w:sz w:val="32"/>
-                <w:szCs w:val="40"/>
-              </w:rPr>
-              <w:t>-  rÉiÉç</w:t>
-            </w:r>
-            <w:proofErr w:type="gramEnd"/>
-            <w:r>
-              <w:rPr>
-                <w:rFonts w:ascii="BRH Devanagari Extra" w:hAnsi="BRH Devanagari Extra" w:cs="BRH Devanagari Extra"/>
-                <w:color w:val="000000"/>
-                <w:sz w:val="32"/>
-                <w:szCs w:val="40"/>
-              </w:rPr>
-              <w:t xml:space="preserve"> | oÉëÔ</w:t>
+              <w:t>)-  rÉiÉç | oÉëÔ</w:t>
             </w:r>
             <w:r>
               <w:rPr>
@@ -2332,19 +2247,8 @@
                 <w:sz w:val="32"/>
                 <w:szCs w:val="40"/>
               </w:rPr>
-              <w:t>)</w:t>
-            </w:r>
-            <w:proofErr w:type="gramStart"/>
-            <w:r>
-              <w:rPr>
-                <w:rFonts w:ascii="BRH Devanagari Extra" w:hAnsi="BRH Devanagari Extra" w:cs="BRH Devanagari Extra"/>
-                <w:color w:val="000000"/>
-                <w:sz w:val="32"/>
-                <w:szCs w:val="40"/>
-              </w:rPr>
-              <w:t>-  oÉëÔ</w:t>
-            </w:r>
-            <w:proofErr w:type="gramEnd"/>
+              <w:t>)-  oÉëÔ</w:t>
+            </w:r>
             <w:r>
               <w:rPr>
                 <w:rFonts w:ascii="BRH Malayalam Extra" w:hAnsi="BRH Malayalam Extra" w:cs="BRH Devanagari Extra"/>
@@ -2637,6 +2541,1177 @@
               </w:rPr>
               <w:t xml:space="preserve">ÎalÉÈ | </w:t>
             </w:r>
+          </w:p>
+        </w:tc>
+      </w:tr>
+      <w:tr>
+        <w:trPr>
+          <w:trHeight w:val="488"/>
+        </w:trPr>
+        <w:tc>
+          <w:tcPr>
+            <w:tcW w:w="7166" w:type="dxa"/>
+          </w:tcPr>
+          <w:p>
+            <w:pPr>
+              <w:widowControl w:val="0"/>
+              <w:autoSpaceDE w:val="0"/>
+              <w:autoSpaceDN w:val="0"/>
+              <w:adjustRightInd w:val="0"/>
+              <w:spacing w:line="240" w:lineRule="auto"/>
+              <w:rPr>
+                <w:rFonts w:ascii="BRH Devanagari Extra" w:hAnsi="BRH Devanagari Extra" w:cs="BRH Devanagari Extra"/>
+                <w:color w:val="000000"/>
+                <w:sz w:val="32"/>
+                <w:szCs w:val="40"/>
+              </w:rPr>
+            </w:pPr>
+            <w:r>
+              <w:rPr>
+                <w:rFonts w:cs="BRH Devanagari Extra"/>
+                <w:color w:val="000000"/>
+                <w:szCs w:val="40"/>
+              </w:rPr>
+              <w:t>17</w:t>
+            </w:r>
+            <w:r>
+              <w:rPr>
+                <w:rFonts w:ascii="BRH Devanagari Extra" w:hAnsi="BRH Devanagari Extra" w:cs="BRH Devanagari Extra"/>
+                <w:color w:val="000000"/>
+                <w:sz w:val="32"/>
+                <w:szCs w:val="40"/>
+              </w:rPr>
+              <w:t>)</w:t>
+            </w:r>
+            <w:r>
+              <w:rPr>
+                <w:rFonts w:ascii="BRH Devanagari Extra" w:hAnsi="BRH Devanagari Extra" w:cs="BRH Devanagari Extra"/>
+                <w:color w:val="000000"/>
+                <w:sz w:val="32"/>
+                <w:szCs w:val="40"/>
+              </w:rPr>
+              <w:tab/>
+            </w:r>
+            <w:r>
+              <w:rPr>
+                <w:rFonts w:cs="BRH Devanagari Extra"/>
+                <w:color w:val="000000"/>
+                <w:szCs w:val="40"/>
+              </w:rPr>
+              <w:t>2</w:t>
+            </w:r>
+            <w:r>
+              <w:rPr>
+                <w:rFonts w:ascii="BRH Devanagari Extra" w:hAnsi="BRH Devanagari Extra" w:cs="BRH Devanagari Extra"/>
+                <w:color w:val="000000"/>
+                <w:sz w:val="32"/>
+                <w:szCs w:val="40"/>
+              </w:rPr>
+              <w:t>.</w:t>
+            </w:r>
+            <w:r>
+              <w:rPr>
+                <w:rFonts w:cs="BRH Devanagari Extra"/>
+                <w:color w:val="000000"/>
+                <w:szCs w:val="40"/>
+              </w:rPr>
+              <w:t>6</w:t>
+            </w:r>
+            <w:r>
+              <w:rPr>
+                <w:rFonts w:ascii="BRH Devanagari Extra" w:hAnsi="BRH Devanagari Extra" w:cs="BRH Devanagari Extra"/>
+                <w:color w:val="000000"/>
+                <w:sz w:val="32"/>
+                <w:szCs w:val="40"/>
+              </w:rPr>
+              <w:t>.</w:t>
+            </w:r>
+            <w:r>
+              <w:rPr>
+                <w:rFonts w:cs="BRH Devanagari Extra"/>
+                <w:color w:val="000000"/>
+                <w:szCs w:val="40"/>
+              </w:rPr>
+              <w:t>12</w:t>
+            </w:r>
+            <w:r>
+              <w:rPr>
+                <w:rFonts w:ascii="BRH Devanagari Extra" w:hAnsi="BRH Devanagari Extra" w:cs="BRH Devanagari Extra"/>
+                <w:color w:val="000000"/>
+                <w:sz w:val="32"/>
+                <w:szCs w:val="40"/>
+              </w:rPr>
+              <w:t>.</w:t>
+            </w:r>
+            <w:r>
+              <w:rPr>
+                <w:rFonts w:cs="BRH Devanagari Extra"/>
+                <w:color w:val="000000"/>
+                <w:szCs w:val="40"/>
+              </w:rPr>
+              <w:t>3</w:t>
+            </w:r>
+            <w:r>
+              <w:rPr>
+                <w:rFonts w:ascii="BRH Devanagari Extra" w:hAnsi="BRH Devanagari Extra" w:cs="BRH Devanagari Extra"/>
+                <w:color w:val="000000"/>
+                <w:sz w:val="32"/>
+                <w:szCs w:val="40"/>
+              </w:rPr>
+              <w:t>(</w:t>
+            </w:r>
+            <w:r>
+              <w:rPr>
+                <w:rFonts w:cs="BRH Devanagari Extra"/>
+                <w:color w:val="000000"/>
+                <w:szCs w:val="40"/>
+              </w:rPr>
+              <w:t>15</w:t>
+            </w:r>
+            <w:r>
+              <w:rPr>
+                <w:rFonts w:ascii="BRH Devanagari Extra" w:hAnsi="BRH Devanagari Extra" w:cs="BRH Devanagari Extra"/>
+                <w:color w:val="000000"/>
+                <w:sz w:val="32"/>
+                <w:szCs w:val="40"/>
+              </w:rPr>
+              <w:t>)-  oÉ</w:t>
+            </w:r>
+            <w:r>
+              <w:rPr>
+                <w:rFonts w:ascii="BRH Malayalam Extra" w:hAnsi="BRH Malayalam Extra" w:cs="BRH Devanagari Extra"/>
+                <w:color w:val="000000"/>
+                <w:szCs w:val="40"/>
+              </w:rPr>
+              <w:t>–</w:t>
+            </w:r>
+            <w:r>
+              <w:rPr>
+                <w:rFonts w:ascii="BRH Devanagari Extra" w:hAnsi="BRH Devanagari Extra" w:cs="BRH Devanagari Extra"/>
+                <w:color w:val="000000"/>
+                <w:sz w:val="32"/>
+                <w:szCs w:val="40"/>
+              </w:rPr>
+              <w:t>Uç</w:t>
+            </w:r>
+            <w:r>
+              <w:rPr>
+                <w:rFonts w:ascii="BRH Malayalam Extra" w:hAnsi="BRH Malayalam Extra" w:cs="BRH Devanagari Extra"/>
+                <w:color w:val="000000"/>
+                <w:szCs w:val="40"/>
+              </w:rPr>
+              <w:t>–</w:t>
+            </w:r>
+            <w:r>
+              <w:rPr>
+                <w:rFonts w:ascii="BRH Devanagari Extra" w:hAnsi="BRH Devanagari Extra" w:cs="BRH Devanagari Extra"/>
+                <w:color w:val="000000"/>
+                <w:sz w:val="32"/>
+                <w:szCs w:val="40"/>
+              </w:rPr>
+              <w:t>.ÌWû</w:t>
+            </w:r>
+            <w:r>
+              <w:rPr>
+                <w:rFonts w:ascii="BRH Malayalam Extra" w:hAnsi="BRH Malayalam Extra" w:cs="BRH Devanagari Extra"/>
+                <w:color w:val="000000"/>
+                <w:szCs w:val="40"/>
+              </w:rPr>
+              <w:t>–</w:t>
+            </w:r>
+            <w:r>
+              <w:rPr>
+                <w:rFonts w:ascii="BRH Devanagari Extra" w:hAnsi="BRH Devanagari Extra" w:cs="BRH Devanagari Extra"/>
+                <w:color w:val="000000"/>
+                <w:sz w:val="32"/>
+                <w:szCs w:val="40"/>
+              </w:rPr>
+              <w:t>wÉSþÈ | rÉå | xuÉ</w:t>
+            </w:r>
+            <w:r>
+              <w:rPr>
+                <w:rFonts w:ascii="BRH Malayalam Extra" w:hAnsi="BRH Malayalam Extra" w:cs="BRH Devanagari Extra"/>
+                <w:color w:val="000000"/>
+                <w:szCs w:val="40"/>
+              </w:rPr>
+              <w:t>–</w:t>
+            </w:r>
+            <w:r>
+              <w:rPr>
+                <w:rFonts w:ascii="BRH Devanagari Extra" w:hAnsi="BRH Devanagari Extra" w:cs="BRH Devanagari Extra"/>
+                <w:color w:val="000000"/>
+                <w:sz w:val="32"/>
+                <w:szCs w:val="40"/>
+              </w:rPr>
+              <w:t xml:space="preserve">kÉrÉÉÿ | </w:t>
+            </w:r>
+          </w:p>
+          <w:p>
+            <w:pPr>
+              <w:widowControl w:val="0"/>
+              <w:autoSpaceDE w:val="0"/>
+              <w:autoSpaceDN w:val="0"/>
+              <w:adjustRightInd w:val="0"/>
+              <w:spacing w:line="240" w:lineRule="auto"/>
+              <w:rPr>
+                <w:rFonts w:ascii="BRH Devanagari Extra" w:hAnsi="BRH Devanagari Extra" w:cs="BRH Devanagari Extra"/>
+                <w:color w:val="000000"/>
+                <w:sz w:val="32"/>
+                <w:szCs w:val="40"/>
+              </w:rPr>
+            </w:pPr>
+            <w:r>
+              <w:rPr>
+                <w:rFonts w:ascii="BRH Devanagari Extra" w:hAnsi="BRH Devanagari Extra" w:cs="BRH Devanagari Extra"/>
+                <w:color w:val="000000"/>
+                <w:sz w:val="32"/>
+                <w:szCs w:val="40"/>
+              </w:rPr>
+              <w:t>oÉ</w:t>
+            </w:r>
+            <w:r>
+              <w:rPr>
+                <w:rFonts w:ascii="BRH Malayalam Extra" w:hAnsi="BRH Malayalam Extra" w:cs="BRH Devanagari Extra"/>
+                <w:color w:val="000000"/>
+                <w:szCs w:val="40"/>
+              </w:rPr>
+              <w:t>–</w:t>
+            </w:r>
+            <w:r>
+              <w:rPr>
+                <w:rFonts w:ascii="BRH Devanagari Extra" w:hAnsi="BRH Devanagari Extra" w:cs="BRH Devanagari Extra"/>
+                <w:color w:val="000000"/>
+                <w:sz w:val="32"/>
+                <w:szCs w:val="40"/>
+              </w:rPr>
+              <w:t>Uç</w:t>
+            </w:r>
+            <w:r>
+              <w:rPr>
+                <w:rFonts w:ascii="BRH Malayalam Extra" w:hAnsi="BRH Malayalam Extra" w:cs="BRH Devanagari Extra"/>
+                <w:color w:val="000000"/>
+                <w:szCs w:val="40"/>
+              </w:rPr>
+              <w:t>–</w:t>
+            </w:r>
+            <w:r>
+              <w:rPr>
+                <w:rFonts w:ascii="BRH Devanagari Extra" w:hAnsi="BRH Devanagari Extra" w:cs="BRH Devanagari Extra"/>
+                <w:color w:val="000000"/>
+                <w:sz w:val="32"/>
+                <w:szCs w:val="40"/>
+              </w:rPr>
+              <w:t>.ÌWû</w:t>
+            </w:r>
+            <w:r>
+              <w:rPr>
+                <w:rFonts w:ascii="BRH Malayalam Extra" w:hAnsi="BRH Malayalam Extra" w:cs="BRH Devanagari Extra"/>
+                <w:color w:val="000000"/>
+                <w:szCs w:val="40"/>
+              </w:rPr>
+              <w:t>–</w:t>
+            </w:r>
+            <w:r>
+              <w:rPr>
+                <w:rFonts w:ascii="BRH Devanagari Extra" w:hAnsi="BRH Devanagari Extra" w:cs="BRH Devanagari Extra"/>
+                <w:color w:val="000000"/>
+                <w:sz w:val="32"/>
+                <w:szCs w:val="40"/>
+              </w:rPr>
+              <w:t>wÉSÉå</w:t>
+            </w:r>
+            <w:r>
+              <w:rPr>
+                <w:rFonts w:ascii="BRH Malayalam Extra" w:hAnsi="BRH Malayalam Extra" w:cs="BRH Devanagari Extra"/>
+                <w:color w:val="000000"/>
+                <w:szCs w:val="40"/>
+              </w:rPr>
+              <w:t>–</w:t>
+            </w:r>
+            <w:r>
+              <w:rPr>
+                <w:rFonts w:ascii="BRH Devanagari Extra" w:hAnsi="BRH Devanagari Extra" w:cs="BRH Devanagari Extra"/>
+                <w:color w:val="000000"/>
+                <w:sz w:val="32"/>
+                <w:szCs w:val="40"/>
+              </w:rPr>
+              <w:t xml:space="preserve"> rÉå rÉå oÉþ</w:t>
+            </w:r>
+            <w:r>
+              <w:rPr>
+                <w:rFonts w:ascii="BRH Devanagari Extra" w:hAnsi="BRH Devanagari Extra" w:cs="BRH Devanagari Extra"/>
+                <w:color w:val="000000"/>
+                <w:sz w:val="32"/>
+                <w:szCs w:val="40"/>
+                <w:highlight w:val="yellow"/>
+              </w:rPr>
+              <w:t>Uç.</w:t>
+            </w:r>
+            <w:r>
+              <w:rPr>
+                <w:rFonts w:ascii="BRH Devanagari Extra" w:hAnsi="BRH Devanagari Extra" w:cs="BRH Devanagari Extra"/>
+                <w:color w:val="000000"/>
+                <w:sz w:val="32"/>
+                <w:szCs w:val="40"/>
+              </w:rPr>
+              <w:t>ÌWû</w:t>
+            </w:r>
+            <w:r>
+              <w:rPr>
+                <w:rFonts w:ascii="BRH Malayalam Extra" w:hAnsi="BRH Malayalam Extra" w:cs="BRH Devanagari Extra"/>
+                <w:color w:val="000000"/>
+                <w:szCs w:val="40"/>
+              </w:rPr>
+              <w:t>–</w:t>
+            </w:r>
+            <w:r>
+              <w:rPr>
+                <w:rFonts w:ascii="BRH Devanagari Extra" w:hAnsi="BRH Devanagari Extra" w:cs="BRH Devanagari Extra"/>
+                <w:color w:val="000000"/>
+                <w:sz w:val="32"/>
+                <w:szCs w:val="40"/>
+              </w:rPr>
+              <w:t>wÉSÉåþ oÉUç.ÌWû</w:t>
+            </w:r>
+            <w:r>
+              <w:rPr>
+                <w:rFonts w:ascii="BRH Malayalam Extra" w:hAnsi="BRH Malayalam Extra" w:cs="BRH Devanagari Extra"/>
+                <w:color w:val="000000"/>
+                <w:szCs w:val="40"/>
+              </w:rPr>
+              <w:t>–</w:t>
+            </w:r>
+            <w:r>
+              <w:rPr>
+                <w:rFonts w:ascii="BRH Devanagari Extra" w:hAnsi="BRH Devanagari Extra" w:cs="BRH Devanagari Extra"/>
+                <w:color w:val="000000"/>
+                <w:sz w:val="32"/>
+                <w:szCs w:val="40"/>
+              </w:rPr>
+              <w:t>wÉSÉå</w:t>
+            </w:r>
+            <w:r>
+              <w:rPr>
+                <w:rFonts w:ascii="BRH Malayalam Extra" w:hAnsi="BRH Malayalam Extra" w:cs="BRH Devanagari Extra"/>
+                <w:color w:val="000000"/>
+                <w:szCs w:val="40"/>
+              </w:rPr>
+              <w:t>–</w:t>
+            </w:r>
+            <w:r>
+              <w:rPr>
+                <w:rFonts w:ascii="BRH Devanagari Extra" w:hAnsi="BRH Devanagari Extra" w:cs="BRH Devanagari Extra"/>
+                <w:color w:val="000000"/>
+                <w:sz w:val="32"/>
+                <w:szCs w:val="40"/>
+              </w:rPr>
+              <w:t xml:space="preserve"> rÉå xuÉ</w:t>
+            </w:r>
+            <w:r>
+              <w:rPr>
+                <w:rFonts w:ascii="BRH Malayalam Extra" w:hAnsi="BRH Malayalam Extra" w:cs="BRH Devanagari Extra"/>
+                <w:color w:val="000000"/>
+                <w:szCs w:val="40"/>
+              </w:rPr>
+              <w:t>–</w:t>
+            </w:r>
+            <w:r>
+              <w:rPr>
+                <w:rFonts w:ascii="BRH Devanagari Extra" w:hAnsi="BRH Devanagari Extra" w:cs="BRH Devanagari Extra"/>
+                <w:color w:val="000000"/>
+                <w:sz w:val="32"/>
+                <w:szCs w:val="40"/>
+              </w:rPr>
+              <w:t>kÉrÉÉÿ xuÉ</w:t>
+            </w:r>
+            <w:r>
+              <w:rPr>
+                <w:rFonts w:ascii="BRH Malayalam Extra" w:hAnsi="BRH Malayalam Extra" w:cs="BRH Devanagari Extra"/>
+                <w:color w:val="000000"/>
+                <w:szCs w:val="40"/>
+              </w:rPr>
+              <w:t>–</w:t>
+            </w:r>
+            <w:r>
+              <w:rPr>
+                <w:rFonts w:ascii="BRH Devanagari Extra" w:hAnsi="BRH Devanagari Extra" w:cs="BRH Devanagari Extra"/>
+                <w:color w:val="000000"/>
+                <w:sz w:val="32"/>
+                <w:szCs w:val="40"/>
+              </w:rPr>
+              <w:t>kÉrÉÉ</w:t>
+            </w:r>
+            <w:r>
+              <w:rPr>
+                <w:rFonts w:ascii="BRH Malayalam Extra" w:hAnsi="BRH Malayalam Extra" w:cs="BRH Devanagari Extra"/>
+                <w:color w:val="000000"/>
+                <w:szCs w:val="40"/>
+              </w:rPr>
+              <w:t>–</w:t>
+            </w:r>
+            <w:r>
+              <w:rPr>
+                <w:rFonts w:ascii="BRH Devanagari Extra" w:hAnsi="BRH Devanagari Extra" w:cs="BRH Devanagari Extra"/>
+                <w:color w:val="000000"/>
+                <w:sz w:val="32"/>
+                <w:szCs w:val="40"/>
+              </w:rPr>
+              <w:t xml:space="preserve"> </w:t>
+            </w:r>
+          </w:p>
+          <w:p>
+            <w:pPr>
+              <w:widowControl w:val="0"/>
+              <w:autoSpaceDE w:val="0"/>
+              <w:autoSpaceDN w:val="0"/>
+              <w:adjustRightInd w:val="0"/>
+              <w:spacing w:line="240" w:lineRule="auto"/>
+              <w:rPr>
+                <w:rFonts w:ascii="BRH Devanagari Extra" w:hAnsi="BRH Devanagari Extra" w:cs="BRH Devanagari Extra"/>
+                <w:color w:val="000000"/>
+                <w:sz w:val="32"/>
+                <w:szCs w:val="40"/>
+              </w:rPr>
+            </w:pPr>
+            <w:r>
+              <w:rPr>
+                <w:rFonts w:ascii="BRH Devanagari Extra" w:hAnsi="BRH Devanagari Extra" w:cs="BRH Devanagari Extra"/>
+                <w:color w:val="000000"/>
+                <w:sz w:val="32"/>
+                <w:szCs w:val="40"/>
+              </w:rPr>
+              <w:t>rÉå oÉþ</w:t>
+            </w:r>
+            <w:r>
+              <w:rPr>
+                <w:rFonts w:ascii="BRH Devanagari Extra" w:hAnsi="BRH Devanagari Extra" w:cs="BRH Devanagari Extra"/>
+                <w:color w:val="000000"/>
+                <w:sz w:val="32"/>
+                <w:szCs w:val="40"/>
+                <w:highlight w:val="yellow"/>
+              </w:rPr>
+              <w:t>Uç.</w:t>
+            </w:r>
+            <w:r>
+              <w:rPr>
+                <w:rFonts w:ascii="BRH Devanagari Extra" w:hAnsi="BRH Devanagari Extra" w:cs="BRH Devanagari Extra"/>
+                <w:color w:val="000000"/>
+                <w:sz w:val="32"/>
+                <w:szCs w:val="40"/>
+              </w:rPr>
+              <w:t>ÌWû</w:t>
+            </w:r>
+            <w:r>
+              <w:rPr>
+                <w:rFonts w:ascii="BRH Malayalam Extra" w:hAnsi="BRH Malayalam Extra" w:cs="BRH Devanagari Extra"/>
+                <w:color w:val="000000"/>
+                <w:szCs w:val="40"/>
+              </w:rPr>
+              <w:t>–</w:t>
+            </w:r>
+            <w:r>
+              <w:rPr>
+                <w:rFonts w:ascii="BRH Devanagari Extra" w:hAnsi="BRH Devanagari Extra" w:cs="BRH Devanagari Extra"/>
+                <w:color w:val="000000"/>
+                <w:sz w:val="32"/>
+                <w:szCs w:val="40"/>
+              </w:rPr>
+              <w:t>wÉSÉåþ oÉUç.ÌWû</w:t>
+            </w:r>
+            <w:r>
+              <w:rPr>
+                <w:rFonts w:ascii="BRH Malayalam Extra" w:hAnsi="BRH Malayalam Extra" w:cs="BRH Devanagari Extra"/>
+                <w:color w:val="000000"/>
+                <w:szCs w:val="40"/>
+              </w:rPr>
+              <w:t>–</w:t>
+            </w:r>
+            <w:r>
+              <w:rPr>
+                <w:rFonts w:ascii="BRH Devanagari Extra" w:hAnsi="BRH Devanagari Extra" w:cs="BRH Devanagari Extra"/>
+                <w:color w:val="000000"/>
+                <w:sz w:val="32"/>
+                <w:szCs w:val="40"/>
+              </w:rPr>
+              <w:t>wÉSÉå</w:t>
+            </w:r>
+            <w:r>
+              <w:rPr>
+                <w:rFonts w:ascii="BRH Malayalam Extra" w:hAnsi="BRH Malayalam Extra" w:cs="BRH Devanagari Extra"/>
+                <w:color w:val="000000"/>
+                <w:szCs w:val="40"/>
+              </w:rPr>
+              <w:t>–</w:t>
+            </w:r>
+            <w:r>
+              <w:rPr>
+                <w:rFonts w:ascii="BRH Devanagari Extra" w:hAnsi="BRH Devanagari Extra" w:cs="BRH Devanagari Extra"/>
+                <w:color w:val="000000"/>
+                <w:sz w:val="32"/>
+                <w:szCs w:val="40"/>
+              </w:rPr>
+              <w:t xml:space="preserve"> rÉå xuÉ</w:t>
+            </w:r>
+            <w:r>
+              <w:rPr>
+                <w:rFonts w:ascii="BRH Malayalam Extra" w:hAnsi="BRH Malayalam Extra" w:cs="BRH Devanagari Extra"/>
+                <w:color w:val="000000"/>
+                <w:szCs w:val="40"/>
+              </w:rPr>
+              <w:t>–</w:t>
+            </w:r>
+            <w:r>
+              <w:rPr>
+                <w:rFonts w:ascii="BRH Devanagari Extra" w:hAnsi="BRH Devanagari Extra" w:cs="BRH Devanagari Extra"/>
+                <w:color w:val="000000"/>
+                <w:sz w:val="32"/>
+                <w:szCs w:val="40"/>
+              </w:rPr>
+              <w:t xml:space="preserve">kÉrÉÉÿ | </w:t>
+            </w:r>
+          </w:p>
+          <w:p>
+            <w:pPr>
+              <w:widowControl w:val="0"/>
+              <w:autoSpaceDE w:val="0"/>
+              <w:autoSpaceDN w:val="0"/>
+              <w:adjustRightInd w:val="0"/>
+              <w:spacing w:before="0" w:line="240" w:lineRule="auto"/>
+              <w:rPr>
+                <w:rFonts w:cs="BRH Malayalam Extra"/>
+                <w:szCs w:val="40"/>
+              </w:rPr>
+            </w:pPr>
+          </w:p>
+        </w:tc>
+        <w:tc>
+          <w:tcPr>
+            <w:tcW w:w="7371" w:type="dxa"/>
+          </w:tcPr>
+          <w:p>
+            <w:pPr>
+              <w:widowControl w:val="0"/>
+              <w:autoSpaceDE w:val="0"/>
+              <w:autoSpaceDN w:val="0"/>
+              <w:adjustRightInd w:val="0"/>
+              <w:spacing w:line="240" w:lineRule="auto"/>
+              <w:rPr>
+                <w:rFonts w:ascii="BRH Devanagari Extra" w:hAnsi="BRH Devanagari Extra" w:cs="BRH Devanagari Extra"/>
+                <w:color w:val="000000"/>
+                <w:sz w:val="32"/>
+                <w:szCs w:val="40"/>
+              </w:rPr>
+            </w:pPr>
+            <w:r>
+              <w:rPr>
+                <w:rFonts w:cs="BRH Devanagari Extra"/>
+                <w:color w:val="000000"/>
+                <w:szCs w:val="40"/>
+              </w:rPr>
+              <w:t>17</w:t>
+            </w:r>
+            <w:r>
+              <w:rPr>
+                <w:rFonts w:ascii="BRH Devanagari Extra" w:hAnsi="BRH Devanagari Extra" w:cs="BRH Devanagari Extra"/>
+                <w:color w:val="000000"/>
+                <w:sz w:val="32"/>
+                <w:szCs w:val="40"/>
+              </w:rPr>
+              <w:t>)</w:t>
+            </w:r>
+            <w:r>
+              <w:rPr>
+                <w:rFonts w:ascii="BRH Devanagari Extra" w:hAnsi="BRH Devanagari Extra" w:cs="BRH Devanagari Extra"/>
+                <w:color w:val="000000"/>
+                <w:sz w:val="32"/>
+                <w:szCs w:val="40"/>
+              </w:rPr>
+              <w:tab/>
+            </w:r>
+            <w:r>
+              <w:rPr>
+                <w:rFonts w:cs="BRH Devanagari Extra"/>
+                <w:color w:val="000000"/>
+                <w:szCs w:val="40"/>
+              </w:rPr>
+              <w:t>2</w:t>
+            </w:r>
+            <w:r>
+              <w:rPr>
+                <w:rFonts w:ascii="BRH Devanagari Extra" w:hAnsi="BRH Devanagari Extra" w:cs="BRH Devanagari Extra"/>
+                <w:color w:val="000000"/>
+                <w:sz w:val="32"/>
+                <w:szCs w:val="40"/>
+              </w:rPr>
+              <w:t>.</w:t>
+            </w:r>
+            <w:r>
+              <w:rPr>
+                <w:rFonts w:cs="BRH Devanagari Extra"/>
+                <w:color w:val="000000"/>
+                <w:szCs w:val="40"/>
+              </w:rPr>
+              <w:t>6</w:t>
+            </w:r>
+            <w:r>
+              <w:rPr>
+                <w:rFonts w:ascii="BRH Devanagari Extra" w:hAnsi="BRH Devanagari Extra" w:cs="BRH Devanagari Extra"/>
+                <w:color w:val="000000"/>
+                <w:sz w:val="32"/>
+                <w:szCs w:val="40"/>
+              </w:rPr>
+              <w:t>.</w:t>
+            </w:r>
+            <w:r>
+              <w:rPr>
+                <w:rFonts w:cs="BRH Devanagari Extra"/>
+                <w:color w:val="000000"/>
+                <w:szCs w:val="40"/>
+              </w:rPr>
+              <w:t>12</w:t>
+            </w:r>
+            <w:r>
+              <w:rPr>
+                <w:rFonts w:ascii="BRH Devanagari Extra" w:hAnsi="BRH Devanagari Extra" w:cs="BRH Devanagari Extra"/>
+                <w:color w:val="000000"/>
+                <w:sz w:val="32"/>
+                <w:szCs w:val="40"/>
+              </w:rPr>
+              <w:t>.</w:t>
+            </w:r>
+            <w:r>
+              <w:rPr>
+                <w:rFonts w:cs="BRH Devanagari Extra"/>
+                <w:color w:val="000000"/>
+                <w:szCs w:val="40"/>
+              </w:rPr>
+              <w:t>3</w:t>
+            </w:r>
+            <w:r>
+              <w:rPr>
+                <w:rFonts w:ascii="BRH Devanagari Extra" w:hAnsi="BRH Devanagari Extra" w:cs="BRH Devanagari Extra"/>
+                <w:color w:val="000000"/>
+                <w:sz w:val="32"/>
+                <w:szCs w:val="40"/>
+              </w:rPr>
+              <w:t>(</w:t>
+            </w:r>
+            <w:r>
+              <w:rPr>
+                <w:rFonts w:cs="BRH Devanagari Extra"/>
+                <w:color w:val="000000"/>
+                <w:szCs w:val="40"/>
+              </w:rPr>
+              <w:t>15</w:t>
+            </w:r>
+            <w:r>
+              <w:rPr>
+                <w:rFonts w:ascii="BRH Devanagari Extra" w:hAnsi="BRH Devanagari Extra" w:cs="BRH Devanagari Extra"/>
+                <w:color w:val="000000"/>
+                <w:sz w:val="32"/>
+                <w:szCs w:val="40"/>
+              </w:rPr>
+              <w:t>)-  oÉ</w:t>
+            </w:r>
+            <w:r>
+              <w:rPr>
+                <w:rFonts w:ascii="BRH Malayalam Extra" w:hAnsi="BRH Malayalam Extra" w:cs="BRH Devanagari Extra"/>
+                <w:color w:val="000000"/>
+                <w:szCs w:val="40"/>
+              </w:rPr>
+              <w:t>–</w:t>
+            </w:r>
+            <w:r>
+              <w:rPr>
+                <w:rFonts w:ascii="BRH Devanagari Extra" w:hAnsi="BRH Devanagari Extra" w:cs="BRH Devanagari Extra"/>
+                <w:color w:val="000000"/>
+                <w:sz w:val="32"/>
+                <w:szCs w:val="40"/>
+              </w:rPr>
+              <w:t>Uç</w:t>
+            </w:r>
+            <w:r>
+              <w:rPr>
+                <w:rFonts w:ascii="BRH Malayalam Extra" w:hAnsi="BRH Malayalam Extra" w:cs="BRH Devanagari Extra"/>
+                <w:color w:val="000000"/>
+                <w:szCs w:val="40"/>
+              </w:rPr>
+              <w:t>–</w:t>
+            </w:r>
+            <w:r>
+              <w:rPr>
+                <w:rFonts w:ascii="BRH Devanagari Extra" w:hAnsi="BRH Devanagari Extra" w:cs="BRH Devanagari Extra"/>
+                <w:color w:val="000000"/>
+                <w:sz w:val="32"/>
+                <w:szCs w:val="40"/>
+              </w:rPr>
+              <w:t>.ÌWû</w:t>
+            </w:r>
+            <w:r>
+              <w:rPr>
+                <w:rFonts w:ascii="BRH Malayalam Extra" w:hAnsi="BRH Malayalam Extra" w:cs="BRH Devanagari Extra"/>
+                <w:color w:val="000000"/>
+                <w:szCs w:val="40"/>
+              </w:rPr>
+              <w:t>–</w:t>
+            </w:r>
+            <w:r>
+              <w:rPr>
+                <w:rFonts w:ascii="BRH Devanagari Extra" w:hAnsi="BRH Devanagari Extra" w:cs="BRH Devanagari Extra"/>
+                <w:color w:val="000000"/>
+                <w:sz w:val="32"/>
+                <w:szCs w:val="40"/>
+              </w:rPr>
+              <w:t>wÉSþÈ | rÉå | xuÉ</w:t>
+            </w:r>
+            <w:r>
+              <w:rPr>
+                <w:rFonts w:ascii="BRH Malayalam Extra" w:hAnsi="BRH Malayalam Extra" w:cs="BRH Devanagari Extra"/>
+                <w:color w:val="000000"/>
+                <w:szCs w:val="40"/>
+              </w:rPr>
+              <w:t>–</w:t>
+            </w:r>
+            <w:r>
+              <w:rPr>
+                <w:rFonts w:ascii="BRH Devanagari Extra" w:hAnsi="BRH Devanagari Extra" w:cs="BRH Devanagari Extra"/>
+                <w:color w:val="000000"/>
+                <w:sz w:val="32"/>
+                <w:szCs w:val="40"/>
+              </w:rPr>
+              <w:t xml:space="preserve">kÉrÉÉÿ | </w:t>
+            </w:r>
+          </w:p>
+          <w:p>
+            <w:pPr>
+              <w:widowControl w:val="0"/>
+              <w:autoSpaceDE w:val="0"/>
+              <w:autoSpaceDN w:val="0"/>
+              <w:adjustRightInd w:val="0"/>
+              <w:spacing w:line="240" w:lineRule="auto"/>
+              <w:rPr>
+                <w:rFonts w:ascii="BRH Devanagari Extra" w:hAnsi="BRH Devanagari Extra" w:cs="BRH Devanagari Extra"/>
+                <w:color w:val="000000"/>
+                <w:sz w:val="32"/>
+                <w:szCs w:val="40"/>
+              </w:rPr>
+            </w:pPr>
+            <w:r>
+              <w:rPr>
+                <w:rFonts w:ascii="BRH Devanagari Extra" w:hAnsi="BRH Devanagari Extra" w:cs="BRH Devanagari Extra"/>
+                <w:color w:val="000000"/>
+                <w:sz w:val="32"/>
+                <w:szCs w:val="40"/>
+              </w:rPr>
+              <w:t>oÉ</w:t>
+            </w:r>
+            <w:r>
+              <w:rPr>
+                <w:rFonts w:ascii="BRH Malayalam Extra" w:hAnsi="BRH Malayalam Extra" w:cs="BRH Devanagari Extra"/>
+                <w:color w:val="000000"/>
+                <w:szCs w:val="40"/>
+              </w:rPr>
+              <w:t>–</w:t>
+            </w:r>
+            <w:r>
+              <w:rPr>
+                <w:rFonts w:ascii="BRH Devanagari Extra" w:hAnsi="BRH Devanagari Extra" w:cs="BRH Devanagari Extra"/>
+                <w:color w:val="000000"/>
+                <w:sz w:val="32"/>
+                <w:szCs w:val="40"/>
+              </w:rPr>
+              <w:t>Uç</w:t>
+            </w:r>
+            <w:r>
+              <w:rPr>
+                <w:rFonts w:ascii="BRH Malayalam Extra" w:hAnsi="BRH Malayalam Extra" w:cs="BRH Devanagari Extra"/>
+                <w:color w:val="000000"/>
+                <w:szCs w:val="40"/>
+              </w:rPr>
+              <w:t>–</w:t>
+            </w:r>
+            <w:r>
+              <w:rPr>
+                <w:rFonts w:ascii="BRH Devanagari Extra" w:hAnsi="BRH Devanagari Extra" w:cs="BRH Devanagari Extra"/>
+                <w:color w:val="000000"/>
+                <w:sz w:val="32"/>
+                <w:szCs w:val="40"/>
+              </w:rPr>
+              <w:t>.ÌWû</w:t>
+            </w:r>
+            <w:r>
+              <w:rPr>
+                <w:rFonts w:ascii="BRH Malayalam Extra" w:hAnsi="BRH Malayalam Extra" w:cs="BRH Devanagari Extra"/>
+                <w:color w:val="000000"/>
+                <w:szCs w:val="40"/>
+              </w:rPr>
+              <w:t>–</w:t>
+            </w:r>
+            <w:r>
+              <w:rPr>
+                <w:rFonts w:ascii="BRH Devanagari Extra" w:hAnsi="BRH Devanagari Extra" w:cs="BRH Devanagari Extra"/>
+                <w:color w:val="000000"/>
+                <w:sz w:val="32"/>
+                <w:szCs w:val="40"/>
+              </w:rPr>
+              <w:t>wÉSÉå</w:t>
+            </w:r>
+            <w:r>
+              <w:rPr>
+                <w:rFonts w:ascii="BRH Malayalam Extra" w:hAnsi="BRH Malayalam Extra" w:cs="BRH Devanagari Extra"/>
+                <w:color w:val="000000"/>
+                <w:szCs w:val="40"/>
+              </w:rPr>
+              <w:t>–</w:t>
+            </w:r>
+            <w:r>
+              <w:rPr>
+                <w:rFonts w:ascii="BRH Devanagari Extra" w:hAnsi="BRH Devanagari Extra" w:cs="BRH Devanagari Extra"/>
+                <w:color w:val="000000"/>
+                <w:sz w:val="32"/>
+                <w:szCs w:val="40"/>
+              </w:rPr>
+              <w:t xml:space="preserve"> rÉå rÉå </w:t>
+            </w:r>
+            <w:r>
+              <w:rPr>
+                <w:rFonts w:ascii="BRH Devanagari Extra" w:hAnsi="BRH Devanagari Extra" w:cs="BRH Devanagari Extra"/>
+                <w:color w:val="000000"/>
+                <w:sz w:val="32"/>
+                <w:szCs w:val="40"/>
+              </w:rPr>
+              <w:t>oÉ</w:t>
+            </w:r>
+            <w:r>
+              <w:rPr>
+                <w:rFonts w:ascii="BRH Devanagari Extra" w:hAnsi="BRH Devanagari Extra" w:cs="BRH Devanagari Extra"/>
+                <w:color w:val="000000"/>
+                <w:sz w:val="32"/>
+                <w:szCs w:val="40"/>
+                <w:highlight w:val="yellow"/>
+              </w:rPr>
+              <w:t>þ</w:t>
+            </w:r>
+            <w:r>
+              <w:rPr>
+                <w:rFonts w:ascii="BRH Devanagari Extra" w:hAnsi="BRH Devanagari Extra" w:cs="BRH Devanagari Extra"/>
+                <w:color w:val="000000"/>
+                <w:sz w:val="32"/>
+                <w:szCs w:val="40"/>
+                <w:highlight w:val="green"/>
+              </w:rPr>
+              <w:t>ÌW</w:t>
+            </w:r>
+            <w:r>
+              <w:rPr>
+                <w:rFonts w:ascii="BRH Devanagari Extra" w:hAnsi="BRH Devanagari Extra" w:cs="BRH Devanagari Extra"/>
+                <w:sz w:val="32"/>
+                <w:szCs w:val="32"/>
+              </w:rPr>
+              <w:t>ï</w:t>
+            </w:r>
+            <w:r>
+              <w:rPr>
+                <w:rFonts w:ascii="BRH Devanagari Extra" w:hAnsi="BRH Devanagari Extra" w:cs="BRH Devanagari Extra"/>
+                <w:color w:val="000000"/>
+                <w:sz w:val="32"/>
+                <w:szCs w:val="40"/>
+              </w:rPr>
+              <w:t>û</w:t>
+            </w:r>
+            <w:r>
+              <w:rPr>
+                <w:rFonts w:ascii="BRH Malayalam Extra" w:hAnsi="BRH Malayalam Extra" w:cs="BRH Devanagari Extra"/>
+                <w:color w:val="000000"/>
+                <w:szCs w:val="40"/>
+              </w:rPr>
+              <w:t>–</w:t>
+            </w:r>
+            <w:r>
+              <w:rPr>
+                <w:rFonts w:ascii="BRH Devanagari Extra" w:hAnsi="BRH Devanagari Extra" w:cs="BRH Devanagari Extra"/>
+                <w:color w:val="000000"/>
+                <w:sz w:val="32"/>
+                <w:szCs w:val="40"/>
+              </w:rPr>
+              <w:t>wÉSÉåþ</w:t>
+            </w:r>
+            <w:r>
+              <w:rPr>
+                <w:rFonts w:ascii="BRH Devanagari Extra" w:hAnsi="BRH Devanagari Extra" w:cs="BRH Devanagari Extra"/>
+                <w:color w:val="000000"/>
+                <w:sz w:val="32"/>
+                <w:szCs w:val="40"/>
+              </w:rPr>
+              <w:t xml:space="preserve"> oÉUç.ÌWû</w:t>
+            </w:r>
+            <w:r>
+              <w:rPr>
+                <w:rFonts w:ascii="BRH Malayalam Extra" w:hAnsi="BRH Malayalam Extra" w:cs="BRH Devanagari Extra"/>
+                <w:color w:val="000000"/>
+                <w:szCs w:val="40"/>
+              </w:rPr>
+              <w:t>–</w:t>
+            </w:r>
+            <w:r>
+              <w:rPr>
+                <w:rFonts w:ascii="BRH Devanagari Extra" w:hAnsi="BRH Devanagari Extra" w:cs="BRH Devanagari Extra"/>
+                <w:color w:val="000000"/>
+                <w:sz w:val="32"/>
+                <w:szCs w:val="40"/>
+              </w:rPr>
+              <w:t>wÉSÉå</w:t>
+            </w:r>
+            <w:r>
+              <w:rPr>
+                <w:rFonts w:ascii="BRH Malayalam Extra" w:hAnsi="BRH Malayalam Extra" w:cs="BRH Devanagari Extra"/>
+                <w:color w:val="000000"/>
+                <w:szCs w:val="40"/>
+              </w:rPr>
+              <w:t>–</w:t>
+            </w:r>
+            <w:r>
+              <w:rPr>
+                <w:rFonts w:ascii="BRH Devanagari Extra" w:hAnsi="BRH Devanagari Extra" w:cs="BRH Devanagari Extra"/>
+                <w:color w:val="000000"/>
+                <w:sz w:val="32"/>
+                <w:szCs w:val="40"/>
+              </w:rPr>
+              <w:t xml:space="preserve"> rÉå xuÉ</w:t>
+            </w:r>
+            <w:r>
+              <w:rPr>
+                <w:rFonts w:ascii="BRH Malayalam Extra" w:hAnsi="BRH Malayalam Extra" w:cs="BRH Devanagari Extra"/>
+                <w:color w:val="000000"/>
+                <w:szCs w:val="40"/>
+              </w:rPr>
+              <w:t>–</w:t>
+            </w:r>
+            <w:r>
+              <w:rPr>
+                <w:rFonts w:ascii="BRH Devanagari Extra" w:hAnsi="BRH Devanagari Extra" w:cs="BRH Devanagari Extra"/>
+                <w:color w:val="000000"/>
+                <w:sz w:val="32"/>
+                <w:szCs w:val="40"/>
+              </w:rPr>
+              <w:t>kÉrÉÉÿ xuÉ</w:t>
+            </w:r>
+            <w:r>
+              <w:rPr>
+                <w:rFonts w:ascii="BRH Malayalam Extra" w:hAnsi="BRH Malayalam Extra" w:cs="BRH Devanagari Extra"/>
+                <w:color w:val="000000"/>
+                <w:szCs w:val="40"/>
+              </w:rPr>
+              <w:t>–</w:t>
+            </w:r>
+            <w:r>
+              <w:rPr>
+                <w:rFonts w:ascii="BRH Devanagari Extra" w:hAnsi="BRH Devanagari Extra" w:cs="BRH Devanagari Extra"/>
+                <w:color w:val="000000"/>
+                <w:sz w:val="32"/>
+                <w:szCs w:val="40"/>
+              </w:rPr>
+              <w:t>kÉrÉÉ</w:t>
+            </w:r>
+            <w:r>
+              <w:rPr>
+                <w:rFonts w:ascii="BRH Malayalam Extra" w:hAnsi="BRH Malayalam Extra" w:cs="BRH Devanagari Extra"/>
+                <w:color w:val="000000"/>
+                <w:szCs w:val="40"/>
+              </w:rPr>
+              <w:t>–</w:t>
+            </w:r>
+            <w:r>
+              <w:rPr>
+                <w:rFonts w:ascii="BRH Devanagari Extra" w:hAnsi="BRH Devanagari Extra" w:cs="BRH Devanagari Extra"/>
+                <w:color w:val="000000"/>
+                <w:sz w:val="32"/>
+                <w:szCs w:val="40"/>
+              </w:rPr>
+              <w:t xml:space="preserve"> </w:t>
+            </w:r>
+          </w:p>
+          <w:p>
+            <w:pPr>
+              <w:widowControl w:val="0"/>
+              <w:autoSpaceDE w:val="0"/>
+              <w:autoSpaceDN w:val="0"/>
+              <w:adjustRightInd w:val="0"/>
+              <w:spacing w:line="240" w:lineRule="auto"/>
+              <w:rPr>
+                <w:rFonts w:ascii="Cambria" w:hAnsi="Cambria" w:cs="BRH Malayalam Extra"/>
+                <w:b/>
+                <w:bCs/>
+                <w:color w:val="000000"/>
+                <w:sz w:val="28"/>
+                <w:szCs w:val="36"/>
+              </w:rPr>
+            </w:pPr>
+            <w:r>
+              <w:rPr>
+                <w:rFonts w:ascii="BRH Devanagari Extra" w:hAnsi="BRH Devanagari Extra" w:cs="BRH Devanagari Extra"/>
+                <w:color w:val="000000"/>
+                <w:sz w:val="32"/>
+                <w:szCs w:val="40"/>
+              </w:rPr>
+              <w:t xml:space="preserve">rÉå </w:t>
+            </w:r>
+            <w:r>
+              <w:rPr>
+                <w:rFonts w:ascii="BRH Devanagari Extra" w:hAnsi="BRH Devanagari Extra" w:cs="BRH Devanagari Extra"/>
+                <w:color w:val="000000"/>
+                <w:sz w:val="32"/>
+                <w:szCs w:val="40"/>
+              </w:rPr>
+              <w:t>oÉ</w:t>
+            </w:r>
+            <w:r>
+              <w:rPr>
+                <w:rFonts w:ascii="BRH Devanagari Extra" w:hAnsi="BRH Devanagari Extra" w:cs="BRH Devanagari Extra"/>
+                <w:color w:val="000000"/>
+                <w:sz w:val="32"/>
+                <w:szCs w:val="40"/>
+                <w:highlight w:val="yellow"/>
+              </w:rPr>
+              <w:t>þ</w:t>
+            </w:r>
+            <w:r>
+              <w:rPr>
+                <w:rFonts w:ascii="BRH Devanagari Extra" w:hAnsi="BRH Devanagari Extra" w:cs="BRH Devanagari Extra"/>
+                <w:color w:val="000000"/>
+                <w:sz w:val="32"/>
+                <w:szCs w:val="40"/>
+                <w:highlight w:val="green"/>
+              </w:rPr>
+              <w:t>ÌW</w:t>
+            </w:r>
+            <w:r>
+              <w:rPr>
+                <w:rFonts w:ascii="BRH Devanagari Extra" w:hAnsi="BRH Devanagari Extra" w:cs="BRH Devanagari Extra"/>
+                <w:sz w:val="32"/>
+                <w:szCs w:val="32"/>
+              </w:rPr>
+              <w:t>ï</w:t>
+            </w:r>
+            <w:r>
+              <w:rPr>
+                <w:rFonts w:ascii="BRH Devanagari Extra" w:hAnsi="BRH Devanagari Extra" w:cs="BRH Devanagari Extra"/>
+                <w:color w:val="000000"/>
+                <w:sz w:val="32"/>
+                <w:szCs w:val="40"/>
+              </w:rPr>
+              <w:t>û</w:t>
+            </w:r>
+            <w:r>
+              <w:rPr>
+                <w:rFonts w:ascii="BRH Malayalam Extra" w:hAnsi="BRH Malayalam Extra" w:cs="BRH Devanagari Extra"/>
+                <w:color w:val="000000"/>
+                <w:szCs w:val="40"/>
+              </w:rPr>
+              <w:t>–</w:t>
+            </w:r>
+            <w:r>
+              <w:rPr>
+                <w:rFonts w:ascii="BRH Devanagari Extra" w:hAnsi="BRH Devanagari Extra" w:cs="BRH Devanagari Extra"/>
+                <w:color w:val="000000"/>
+                <w:sz w:val="32"/>
+                <w:szCs w:val="40"/>
+              </w:rPr>
+              <w:t>wÉSÉåþ</w:t>
+            </w:r>
+            <w:r>
+              <w:rPr>
+                <w:rFonts w:ascii="BRH Devanagari Extra" w:hAnsi="BRH Devanagari Extra" w:cs="BRH Devanagari Extra"/>
+                <w:color w:val="000000"/>
+                <w:sz w:val="32"/>
+                <w:szCs w:val="40"/>
+              </w:rPr>
+              <w:t xml:space="preserve"> oÉUç.ÌWû</w:t>
+            </w:r>
+            <w:r>
+              <w:rPr>
+                <w:rFonts w:ascii="BRH Malayalam Extra" w:hAnsi="BRH Malayalam Extra" w:cs="BRH Devanagari Extra"/>
+                <w:color w:val="000000"/>
+                <w:szCs w:val="40"/>
+              </w:rPr>
+              <w:t>–</w:t>
+            </w:r>
+            <w:r>
+              <w:rPr>
+                <w:rFonts w:ascii="BRH Devanagari Extra" w:hAnsi="BRH Devanagari Extra" w:cs="BRH Devanagari Extra"/>
+                <w:color w:val="000000"/>
+                <w:sz w:val="32"/>
+                <w:szCs w:val="40"/>
+              </w:rPr>
+              <w:t>wÉSÉå</w:t>
+            </w:r>
+            <w:r>
+              <w:rPr>
+                <w:rFonts w:ascii="BRH Malayalam Extra" w:hAnsi="BRH Malayalam Extra" w:cs="BRH Devanagari Extra"/>
+                <w:color w:val="000000"/>
+                <w:szCs w:val="40"/>
+              </w:rPr>
+              <w:t>–</w:t>
+            </w:r>
+            <w:r>
+              <w:rPr>
+                <w:rFonts w:ascii="BRH Devanagari Extra" w:hAnsi="BRH Devanagari Extra" w:cs="BRH Devanagari Extra"/>
+                <w:color w:val="000000"/>
+                <w:sz w:val="32"/>
+                <w:szCs w:val="40"/>
+              </w:rPr>
+              <w:t xml:space="preserve"> rÉå xuÉ</w:t>
+            </w:r>
+            <w:r>
+              <w:rPr>
+                <w:rFonts w:ascii="BRH Malayalam Extra" w:hAnsi="BRH Malayalam Extra" w:cs="BRH Devanagari Extra"/>
+                <w:color w:val="000000"/>
+                <w:szCs w:val="40"/>
+              </w:rPr>
+              <w:t>–</w:t>
+            </w:r>
+            <w:r>
+              <w:rPr>
+                <w:rFonts w:ascii="BRH Devanagari Extra" w:hAnsi="BRH Devanagari Extra" w:cs="BRH Devanagari Extra"/>
+                <w:color w:val="000000"/>
+                <w:sz w:val="32"/>
+                <w:szCs w:val="40"/>
+              </w:rPr>
+              <w:t xml:space="preserve">kÉrÉÉÿ | </w:t>
+            </w:r>
+            <w:r>
+              <w:rPr>
+                <w:rFonts w:ascii="BRH Malayalam Extra" w:hAnsi="BRH Malayalam Extra" w:cs="BRH Malayalam Extra"/>
+                <w:color w:val="000000"/>
+                <w:sz w:val="32"/>
+                <w:szCs w:val="40"/>
+              </w:rPr>
+              <w:t xml:space="preserve"> </w:t>
+            </w:r>
+            <w:r>
+              <w:rPr>
+                <w:rFonts w:ascii="Cambria" w:hAnsi="Cambria" w:cs="BRH Malayalam Extra"/>
+                <w:b/>
+                <w:bCs/>
+                <w:color w:val="000000"/>
+                <w:sz w:val="28"/>
+                <w:szCs w:val="36"/>
+              </w:rPr>
+              <w:t>swarabhakti disappears</w:t>
+            </w:r>
+          </w:p>
+          <w:p>
+            <w:pPr>
+              <w:widowControl w:val="0"/>
+              <w:autoSpaceDE w:val="0"/>
+              <w:autoSpaceDN w:val="0"/>
+              <w:adjustRightInd w:val="0"/>
+              <w:spacing w:before="0" w:line="240" w:lineRule="auto"/>
+              <w:rPr>
+                <w:rFonts w:cs="BRH Malayalam Extra"/>
+                <w:szCs w:val="40"/>
+              </w:rPr>
+            </w:pPr>
           </w:p>
         </w:tc>
       </w:tr>
@@ -2897,7 +3972,6 @@
                 <w:sz w:val="32"/>
                 <w:szCs w:val="32"/>
               </w:rPr>
-              <w:lastRenderedPageBreak/>
               <w:t>As Printed</w:t>
             </w:r>
           </w:p>
@@ -3067,27 +4141,7 @@
                 <w:sz w:val="32"/>
                 <w:szCs w:val="40"/>
               </w:rPr>
-              <w:t>)</w:t>
-            </w:r>
-            <w:proofErr w:type="gramStart"/>
-            <w:r>
-              <w:rPr>
-                <w:rFonts w:ascii="BRH Devanagari Extra" w:hAnsi="BRH Devanagari Extra" w:cs="BRH Devanagari Extra"/>
-                <w:color w:val="000000"/>
-                <w:sz w:val="32"/>
-                <w:szCs w:val="40"/>
-              </w:rPr>
-              <w:t>-  GcÉÿqÉç</w:t>
-            </w:r>
-            <w:proofErr w:type="gramEnd"/>
-            <w:r>
-              <w:rPr>
-                <w:rFonts w:ascii="BRH Devanagari Extra" w:hAnsi="BRH Devanagari Extra" w:cs="BRH Devanagari Extra"/>
-                <w:color w:val="000000"/>
-                <w:sz w:val="32"/>
-                <w:szCs w:val="40"/>
-              </w:rPr>
-              <w:t xml:space="preserve"> | A</w:t>
+              <w:t>)-  GcÉÿqÉç | A</w:t>
             </w:r>
             <w:r>
               <w:rPr>
@@ -3467,19 +4521,8 @@
                 <w:sz w:val="32"/>
                 <w:szCs w:val="40"/>
               </w:rPr>
-              <w:t>)</w:t>
-            </w:r>
-            <w:proofErr w:type="gramStart"/>
-            <w:r>
-              <w:rPr>
-                <w:rFonts w:ascii="BRH Devanagari Extra" w:hAnsi="BRH Devanagari Extra" w:cs="BRH Devanagari Extra"/>
-                <w:color w:val="000000"/>
-                <w:sz w:val="32"/>
-                <w:szCs w:val="40"/>
-              </w:rPr>
-              <w:t>-  A</w:t>
-            </w:r>
-            <w:proofErr w:type="gramEnd"/>
+              <w:t>)-  A</w:t>
+            </w:r>
             <w:r>
               <w:rPr>
                 <w:rFonts w:ascii="BRH Malayalam Extra" w:hAnsi="BRH Malayalam Extra" w:cs="BRH Devanagari Extra"/>
@@ -4023,17 +5066,7 @@
                 <w:sz w:val="32"/>
                 <w:szCs w:val="40"/>
               </w:rPr>
-              <w:t>)</w:t>
-            </w:r>
-            <w:proofErr w:type="gramStart"/>
-            <w:r>
-              <w:rPr>
-                <w:rFonts w:ascii="BRH Devanagari Extra" w:hAnsi="BRH Devanagari Extra" w:cs="BRH Devanagari Extra"/>
-                <w:color w:val="000000"/>
-                <w:sz w:val="32"/>
-                <w:szCs w:val="40"/>
-              </w:rPr>
-              <w:t>-  AÉerÉþpÉÉ</w:t>
+              <w:t>)-  AÉerÉþpÉÉ</w:t>
             </w:r>
             <w:r>
               <w:rPr>
@@ -4045,7 +5078,6 @@
               </w:rPr>
               <w:t>aÉ</w:t>
             </w:r>
-            <w:proofErr w:type="gramEnd"/>
             <w:r>
               <w:rPr>
                 <w:rFonts w:ascii="BRH Malayalam Extra" w:hAnsi="BRH Malayalam Extra" w:cs="BRH Devanagari Extra"/>
@@ -4319,6 +5351,7 @@
                 <w:szCs w:val="40"/>
                 <w:highlight w:val="yellow"/>
               </w:rPr>
+              <w:lastRenderedPageBreak/>
               <w:t>eÉ</w:t>
             </w:r>
             <w:r>
@@ -4598,17 +5631,7 @@
                 <w:sz w:val="32"/>
                 <w:szCs w:val="40"/>
               </w:rPr>
-              <w:t>)</w:t>
-            </w:r>
-            <w:proofErr w:type="gramStart"/>
-            <w:r>
-              <w:rPr>
-                <w:rFonts w:ascii="BRH Devanagari Extra" w:hAnsi="BRH Devanagari Extra" w:cs="BRH Devanagari Extra"/>
-                <w:color w:val="000000"/>
-                <w:sz w:val="32"/>
-                <w:szCs w:val="40"/>
-              </w:rPr>
-              <w:t>-  AÉerÉþpÉÉ</w:t>
+              <w:t>)-  AÉerÉþpÉÉ</w:t>
             </w:r>
             <w:r>
               <w:rPr>
@@ -4620,7 +5643,6 @@
               </w:rPr>
               <w:t>aÉ</w:t>
             </w:r>
-            <w:proofErr w:type="gramEnd"/>
             <w:r>
               <w:rPr>
                 <w:rFonts w:ascii="BRH Malayalam Extra" w:hAnsi="BRH Malayalam Extra" w:cs="BRH Devanagari Extra"/>
@@ -4658,7 +5680,6 @@
                 <w:sz w:val="32"/>
                 <w:szCs w:val="40"/>
               </w:rPr>
-              <w:lastRenderedPageBreak/>
               <w:t>AÉerÉþpÉÉaÉ</w:t>
             </w:r>
             <w:r>
@@ -4868,27 +5889,7 @@
                 <w:sz w:val="32"/>
                 <w:szCs w:val="40"/>
               </w:rPr>
-              <w:t>)</w:t>
-            </w:r>
-            <w:proofErr w:type="gramStart"/>
-            <w:r>
-              <w:rPr>
-                <w:rFonts w:ascii="BRH Devanagari Extra" w:hAnsi="BRH Devanagari Extra" w:cs="BRH Devanagari Extra"/>
-                <w:color w:val="000000"/>
-                <w:sz w:val="32"/>
-                <w:szCs w:val="40"/>
-              </w:rPr>
-              <w:t>-  GcÉÿqÉç</w:t>
-            </w:r>
-            <w:proofErr w:type="gramEnd"/>
-            <w:r>
-              <w:rPr>
-                <w:rFonts w:ascii="BRH Devanagari Extra" w:hAnsi="BRH Devanagari Extra" w:cs="BRH Devanagari Extra"/>
-                <w:color w:val="000000"/>
-                <w:sz w:val="32"/>
-                <w:szCs w:val="40"/>
-              </w:rPr>
-              <w:t xml:space="preserve"> | A</w:t>
+              <w:t>)-  GcÉÿqÉç | A</w:t>
             </w:r>
             <w:r>
               <w:rPr>
@@ -5264,19 +6265,8 @@
                 <w:sz w:val="32"/>
                 <w:szCs w:val="40"/>
               </w:rPr>
-              <w:t>)</w:t>
-            </w:r>
-            <w:proofErr w:type="gramStart"/>
-            <w:r>
-              <w:rPr>
-                <w:rFonts w:ascii="BRH Devanagari Extra" w:hAnsi="BRH Devanagari Extra" w:cs="BRH Devanagari Extra"/>
-                <w:color w:val="000000"/>
-                <w:sz w:val="32"/>
-                <w:szCs w:val="40"/>
-              </w:rPr>
-              <w:t>-  A</w:t>
-            </w:r>
-            <w:proofErr w:type="gramEnd"/>
+              <w:t>)-  A</w:t>
+            </w:r>
             <w:r>
               <w:rPr>
                 <w:rFonts w:ascii="BRH Malayalam Extra" w:hAnsi="BRH Malayalam Extra" w:cs="BRH Devanagari Extra"/>
@@ -5786,17 +6776,7 @@
                 <w:sz w:val="32"/>
                 <w:szCs w:val="40"/>
               </w:rPr>
-              <w:t>)</w:t>
-            </w:r>
-            <w:proofErr w:type="gramStart"/>
-            <w:r>
-              <w:rPr>
-                <w:rFonts w:ascii="BRH Devanagari Extra" w:hAnsi="BRH Devanagari Extra" w:cs="BRH Devanagari Extra"/>
-                <w:color w:val="000000"/>
-                <w:sz w:val="32"/>
-                <w:szCs w:val="40"/>
-              </w:rPr>
-              <w:t>-  AÉerÉþpÉÉ</w:t>
+              <w:t>)-  AÉerÉþpÉÉ</w:t>
             </w:r>
             <w:r>
               <w:rPr>
@@ -5815,17 +6795,7 @@
                 <w:sz w:val="32"/>
                 <w:szCs w:val="40"/>
               </w:rPr>
-              <w:t>xrÉ</w:t>
-            </w:r>
-            <w:proofErr w:type="gramEnd"/>
-            <w:r>
-              <w:rPr>
-                <w:rFonts w:ascii="BRH Devanagari Extra" w:hAnsi="BRH Devanagari Extra" w:cs="BRH Devanagari Extra"/>
-                <w:color w:val="000000"/>
-                <w:sz w:val="32"/>
-                <w:szCs w:val="40"/>
-              </w:rPr>
-              <w:t xml:space="preserve"> | eÉÑ</w:t>
+              <w:t>xrÉ | eÉÑ</w:t>
             </w:r>
             <w:r>
               <w:rPr>
@@ -6067,6 +7037,7 @@
                 <w:szCs w:val="40"/>
                 <w:highlight w:val="green"/>
               </w:rPr>
+              <w:lastRenderedPageBreak/>
               <w:t>eÉ</w:t>
             </w:r>
             <w:r>
@@ -6338,17 +7309,7 @@
                 <w:sz w:val="32"/>
                 <w:szCs w:val="40"/>
               </w:rPr>
-              <w:t>)</w:t>
-            </w:r>
-            <w:proofErr w:type="gramStart"/>
-            <w:r>
-              <w:rPr>
-                <w:rFonts w:ascii="BRH Devanagari Extra" w:hAnsi="BRH Devanagari Extra" w:cs="BRH Devanagari Extra"/>
-                <w:color w:val="000000"/>
-                <w:sz w:val="32"/>
-                <w:szCs w:val="40"/>
-              </w:rPr>
-              <w:t>-  AÉerÉþpÉÉ</w:t>
+              <w:t>)-  AÉerÉþpÉÉ</w:t>
             </w:r>
             <w:r>
               <w:rPr>
@@ -6367,17 +7328,7 @@
                 <w:sz w:val="32"/>
                 <w:szCs w:val="40"/>
               </w:rPr>
-              <w:t>xrÉ</w:t>
-            </w:r>
-            <w:proofErr w:type="gramEnd"/>
-            <w:r>
-              <w:rPr>
-                <w:rFonts w:ascii="BRH Devanagari Extra" w:hAnsi="BRH Devanagari Extra" w:cs="BRH Devanagari Extra"/>
-                <w:color w:val="000000"/>
-                <w:sz w:val="32"/>
-                <w:szCs w:val="40"/>
-              </w:rPr>
-              <w:t xml:space="preserve"> |</w:t>
+              <w:t>xrÉ |</w:t>
             </w:r>
           </w:p>
           <w:p>
@@ -6401,7 +7352,6 @@
                 <w:sz w:val="32"/>
                 <w:szCs w:val="40"/>
               </w:rPr>
-              <w:lastRenderedPageBreak/>
               <w:t>AÉerÉþpÉÉaÉ</w:t>
             </w:r>
             <w:r>
@@ -6620,19 +7570,8 @@
                 <w:sz w:val="32"/>
                 <w:szCs w:val="40"/>
               </w:rPr>
-              <w:t>)</w:t>
-            </w:r>
-            <w:proofErr w:type="gramStart"/>
-            <w:r>
-              <w:rPr>
-                <w:rFonts w:ascii="BRH Devanagari Extra" w:hAnsi="BRH Devanagari Extra" w:cs="BRH Devanagari Extra"/>
-                <w:color w:val="000000"/>
-                <w:sz w:val="32"/>
-                <w:szCs w:val="40"/>
-              </w:rPr>
-              <w:t>-  kÉå</w:t>
-            </w:r>
-            <w:proofErr w:type="gramEnd"/>
+              <w:t>)-  kÉå</w:t>
+            </w:r>
             <w:r>
               <w:rPr>
                 <w:rFonts w:ascii="BRH Malayalam Extra" w:hAnsi="BRH Malayalam Extra" w:cs="BRH Devanagari Extra"/>
@@ -7058,27 +7997,7 @@
                 <w:sz w:val="32"/>
                 <w:szCs w:val="40"/>
               </w:rPr>
-              <w:t>)</w:t>
-            </w:r>
-            <w:proofErr w:type="gramStart"/>
-            <w:r>
-              <w:rPr>
-                <w:rFonts w:ascii="BRH Devanagari Extra" w:hAnsi="BRH Devanagari Extra" w:cs="BRH Devanagari Extra"/>
-                <w:color w:val="000000"/>
-                <w:sz w:val="32"/>
-                <w:szCs w:val="40"/>
-              </w:rPr>
-              <w:t>-  CÌiÉþ</w:t>
-            </w:r>
-            <w:proofErr w:type="gramEnd"/>
-            <w:r>
-              <w:rPr>
-                <w:rFonts w:ascii="BRH Devanagari Extra" w:hAnsi="BRH Devanagari Extra" w:cs="BRH Devanagari Extra"/>
-                <w:color w:val="000000"/>
-                <w:sz w:val="32"/>
-                <w:szCs w:val="40"/>
-              </w:rPr>
-              <w:t xml:space="preserve"> | mÉÑ</w:t>
+              <w:t>)-  CÌiÉþ | mÉÑ</w:t>
             </w:r>
             <w:r>
               <w:rPr>
@@ -7671,19 +8590,8 @@
                 <w:sz w:val="32"/>
                 <w:szCs w:val="40"/>
               </w:rPr>
-              <w:t>)</w:t>
-            </w:r>
-            <w:proofErr w:type="gramStart"/>
-            <w:r>
-              <w:rPr>
-                <w:rFonts w:ascii="BRH Devanagari Extra" w:hAnsi="BRH Devanagari Extra" w:cs="BRH Devanagari Extra"/>
-                <w:color w:val="000000"/>
-                <w:sz w:val="32"/>
-                <w:szCs w:val="40"/>
-              </w:rPr>
-              <w:t>-  mÉÑ</w:t>
-            </w:r>
-            <w:proofErr w:type="gramEnd"/>
+              <w:t>)-  mÉÑ</w:t>
+            </w:r>
             <w:r>
               <w:rPr>
                 <w:rFonts w:ascii="BRH Malayalam Extra" w:hAnsi="BRH Malayalam Extra" w:cs="BRH Devanagari Extra"/>
@@ -8061,6 +8969,7 @@
                 <w:sz w:val="32"/>
                 <w:szCs w:val="40"/>
               </w:rPr>
+              <w:lastRenderedPageBreak/>
               <w:t>mÉÑ</w:t>
             </w:r>
             <w:r>
@@ -8459,19 +9368,8 @@
                 <w:sz w:val="32"/>
                 <w:szCs w:val="40"/>
               </w:rPr>
-              <w:t>)</w:t>
-            </w:r>
-            <w:proofErr w:type="gramStart"/>
-            <w:r>
-              <w:rPr>
-                <w:rFonts w:ascii="BRH Devanagari Extra" w:hAnsi="BRH Devanagari Extra" w:cs="BRH Devanagari Extra"/>
-                <w:color w:val="000000"/>
-                <w:sz w:val="32"/>
-                <w:szCs w:val="40"/>
-              </w:rPr>
-              <w:t>-  mÉÑ</w:t>
-            </w:r>
-            <w:proofErr w:type="gramEnd"/>
+              <w:t>)-  mÉÑ</w:t>
+            </w:r>
             <w:r>
               <w:rPr>
                 <w:rFonts w:ascii="BRH Malayalam Extra" w:hAnsi="BRH Malayalam Extra" w:cs="BRH Devanagari Extra"/>
@@ -8538,7 +9436,6 @@
                 <w:sz w:val="32"/>
                 <w:szCs w:val="40"/>
               </w:rPr>
-              <w:lastRenderedPageBreak/>
               <w:t>mÉÑ</w:t>
             </w:r>
             <w:r>
@@ -8769,19 +9666,8 @@
                 <w:sz w:val="32"/>
                 <w:szCs w:val="40"/>
               </w:rPr>
-              <w:t>)</w:t>
-            </w:r>
-            <w:proofErr w:type="gramStart"/>
-            <w:r>
-              <w:rPr>
-                <w:rFonts w:ascii="BRH Devanagari Extra" w:hAnsi="BRH Devanagari Extra" w:cs="BRH Devanagari Extra"/>
-                <w:color w:val="000000"/>
-                <w:sz w:val="32"/>
-                <w:szCs w:val="40"/>
-              </w:rPr>
-              <w:t>-  kÉå</w:t>
-            </w:r>
-            <w:proofErr w:type="gramEnd"/>
+              <w:t>)-  kÉå</w:t>
+            </w:r>
             <w:r>
               <w:rPr>
                 <w:rFonts w:ascii="BRH Malayalam Extra" w:hAnsi="BRH Malayalam Extra" w:cs="BRH Devanagari Extra"/>
@@ -9198,27 +10084,7 @@
                 <w:sz w:val="32"/>
                 <w:szCs w:val="40"/>
               </w:rPr>
-              <w:t>)</w:t>
-            </w:r>
-            <w:proofErr w:type="gramStart"/>
-            <w:r>
-              <w:rPr>
-                <w:rFonts w:ascii="BRH Devanagari Extra" w:hAnsi="BRH Devanagari Extra" w:cs="BRH Devanagari Extra"/>
-                <w:color w:val="000000"/>
-                <w:sz w:val="32"/>
-                <w:szCs w:val="40"/>
-              </w:rPr>
-              <w:t>-  CÌiÉþ</w:t>
-            </w:r>
-            <w:proofErr w:type="gramEnd"/>
-            <w:r>
-              <w:rPr>
-                <w:rFonts w:ascii="BRH Devanagari Extra" w:hAnsi="BRH Devanagari Extra" w:cs="BRH Devanagari Extra"/>
-                <w:color w:val="000000"/>
-                <w:sz w:val="32"/>
-                <w:szCs w:val="40"/>
-              </w:rPr>
-              <w:t xml:space="preserve"> | mÉÑ</w:t>
+              <w:t>)-  CÌiÉþ | mÉÑ</w:t>
             </w:r>
             <w:r>
               <w:rPr>
@@ -9781,19 +10647,8 @@
                 <w:sz w:val="32"/>
                 <w:szCs w:val="40"/>
               </w:rPr>
-              <w:t>)</w:t>
-            </w:r>
-            <w:proofErr w:type="gramStart"/>
-            <w:r>
-              <w:rPr>
-                <w:rFonts w:ascii="BRH Devanagari Extra" w:hAnsi="BRH Devanagari Extra" w:cs="BRH Devanagari Extra"/>
-                <w:color w:val="000000"/>
-                <w:sz w:val="32"/>
-                <w:szCs w:val="40"/>
-              </w:rPr>
-              <w:t>-  mÉÑ</w:t>
-            </w:r>
-            <w:proofErr w:type="gramEnd"/>
+              <w:t>)-  mÉÑ</w:t>
+            </w:r>
             <w:r>
               <w:rPr>
                 <w:rFonts w:ascii="BRH Malayalam Extra" w:hAnsi="BRH Malayalam Extra" w:cs="BRH Devanagari Extra"/>
@@ -10120,6 +10975,7 @@
                 <w:sz w:val="32"/>
                 <w:szCs w:val="40"/>
               </w:rPr>
+              <w:lastRenderedPageBreak/>
               <w:t>mÉÑ</w:t>
             </w:r>
             <w:r>
@@ -10467,19 +11323,8 @@
                 <w:sz w:val="32"/>
                 <w:szCs w:val="40"/>
               </w:rPr>
-              <w:t>)</w:t>
-            </w:r>
-            <w:proofErr w:type="gramStart"/>
-            <w:r>
-              <w:rPr>
-                <w:rFonts w:ascii="BRH Devanagari Extra" w:hAnsi="BRH Devanagari Extra" w:cs="BRH Devanagari Extra"/>
-                <w:color w:val="000000"/>
-                <w:sz w:val="32"/>
-                <w:szCs w:val="40"/>
-              </w:rPr>
-              <w:t>-  mÉÑ</w:t>
-            </w:r>
-            <w:proofErr w:type="gramEnd"/>
+              <w:t>)-  mÉÑ</w:t>
+            </w:r>
             <w:r>
               <w:rPr>
                 <w:rFonts w:ascii="BRH Malayalam Extra" w:hAnsi="BRH Malayalam Extra" w:cs="BRH Devanagari Extra"/>
@@ -10545,7 +11390,6 @@
                 <w:sz w:val="32"/>
                 <w:szCs w:val="40"/>
               </w:rPr>
-              <w:lastRenderedPageBreak/>
               <w:t>mÉÑ</w:t>
             </w:r>
             <w:r>
@@ -10768,27 +11612,7 @@
                 <w:sz w:val="32"/>
                 <w:szCs w:val="40"/>
               </w:rPr>
-              <w:t>)</w:t>
-            </w:r>
-            <w:proofErr w:type="gramStart"/>
-            <w:r>
-              <w:rPr>
-                <w:rFonts w:ascii="BRH Devanagari Extra" w:hAnsi="BRH Devanagari Extra" w:cs="BRH Devanagari Extra"/>
-                <w:color w:val="000000"/>
-                <w:sz w:val="32"/>
-                <w:szCs w:val="40"/>
-              </w:rPr>
-              <w:t>-  mÉë</w:t>
-            </w:r>
-            <w:proofErr w:type="gramEnd"/>
-            <w:r>
-              <w:rPr>
-                <w:rFonts w:ascii="BRH Devanagari Extra" w:hAnsi="BRH Devanagari Extra" w:cs="BRH Devanagari Extra"/>
-                <w:color w:val="000000"/>
-                <w:sz w:val="32"/>
-                <w:szCs w:val="40"/>
-              </w:rPr>
-              <w:t xml:space="preserve"> | lÉÑ</w:t>
+              <w:t>)-  mÉë | lÉÑ</w:t>
             </w:r>
             <w:r>
               <w:rPr>
@@ -11230,19 +12054,8 @@
                 <w:sz w:val="32"/>
                 <w:szCs w:val="40"/>
               </w:rPr>
-              <w:t>)</w:t>
-            </w:r>
-            <w:proofErr w:type="gramStart"/>
-            <w:r>
-              <w:rPr>
-                <w:rFonts w:ascii="BRH Devanagari Extra" w:hAnsi="BRH Devanagari Extra" w:cs="BRH Devanagari Extra"/>
-                <w:color w:val="000000"/>
-                <w:sz w:val="32"/>
-                <w:szCs w:val="40"/>
-              </w:rPr>
-              <w:t>-  lÉÑ</w:t>
-            </w:r>
-            <w:proofErr w:type="gramEnd"/>
+              <w:t>)-  lÉÑ</w:t>
+            </w:r>
             <w:r>
               <w:rPr>
                 <w:rFonts w:ascii="BRH Malayalam Extra" w:hAnsi="BRH Malayalam Extra" w:cs="BRH Devanagari Extra"/>
@@ -11849,19 +12662,8 @@
                 <w:sz w:val="32"/>
                 <w:szCs w:val="40"/>
               </w:rPr>
-              <w:t>)</w:t>
-            </w:r>
-            <w:proofErr w:type="gramStart"/>
-            <w:r>
-              <w:rPr>
-                <w:rFonts w:ascii="BRH Devanagari Extra" w:hAnsi="BRH Devanagari Extra" w:cs="BRH Devanagari Extra"/>
-                <w:color w:val="000000"/>
-                <w:sz w:val="32"/>
-                <w:szCs w:val="40"/>
-              </w:rPr>
-              <w:t>-  E</w:t>
-            </w:r>
-            <w:proofErr w:type="gramEnd"/>
+              <w:t>)-  E</w:t>
+            </w:r>
             <w:r>
               <w:rPr>
                 <w:rFonts w:ascii="BRH Malayalam Extra" w:hAnsi="BRH Malayalam Extra" w:cs="BRH Devanagari Extra"/>
@@ -12178,6 +12980,7 @@
                 <w:sz w:val="32"/>
                 <w:szCs w:val="40"/>
               </w:rPr>
+              <w:lastRenderedPageBreak/>
               <w:t>rÉÉ</w:t>
             </w:r>
             <w:r>
@@ -12383,7 +13186,6 @@
                 <w:color w:val="000000"/>
                 <w:szCs w:val="40"/>
               </w:rPr>
-              <w:lastRenderedPageBreak/>
               <w:t>59</w:t>
             </w:r>
             <w:r>
@@ -12487,19 +13289,8 @@
                 <w:sz w:val="32"/>
                 <w:szCs w:val="40"/>
               </w:rPr>
-              <w:t>)</w:t>
-            </w:r>
-            <w:proofErr w:type="gramStart"/>
-            <w:r>
-              <w:rPr>
-                <w:rFonts w:ascii="BRH Devanagari Extra" w:hAnsi="BRH Devanagari Extra" w:cs="BRH Devanagari Extra"/>
-                <w:color w:val="000000"/>
-                <w:sz w:val="32"/>
-                <w:szCs w:val="40"/>
-              </w:rPr>
-              <w:t>-  E</w:t>
-            </w:r>
-            <w:proofErr w:type="gramEnd"/>
+              <w:t>)-  E</w:t>
+            </w:r>
             <w:r>
               <w:rPr>
                 <w:rFonts w:ascii="BRH Malayalam Extra" w:hAnsi="BRH Malayalam Extra" w:cs="BRH Devanagari Extra"/>
@@ -12797,27 +13588,7 @@
                 <w:sz w:val="32"/>
                 <w:szCs w:val="40"/>
               </w:rPr>
-              <w:t>)</w:t>
-            </w:r>
-            <w:proofErr w:type="gramStart"/>
-            <w:r>
-              <w:rPr>
-                <w:rFonts w:ascii="BRH Devanagari Extra" w:hAnsi="BRH Devanagari Extra" w:cs="BRH Devanagari Extra"/>
-                <w:color w:val="000000"/>
-                <w:sz w:val="32"/>
-                <w:szCs w:val="40"/>
-              </w:rPr>
-              <w:t>-  mÉë</w:t>
-            </w:r>
-            <w:proofErr w:type="gramEnd"/>
-            <w:r>
-              <w:rPr>
-                <w:rFonts w:ascii="BRH Devanagari Extra" w:hAnsi="BRH Devanagari Extra" w:cs="BRH Devanagari Extra"/>
-                <w:color w:val="000000"/>
-                <w:sz w:val="32"/>
-                <w:szCs w:val="40"/>
-              </w:rPr>
-              <w:t xml:space="preserve"> | lÉÑ</w:t>
+              <w:t>)-  mÉë | lÉÑ</w:t>
             </w:r>
             <w:r>
               <w:rPr>
@@ -13241,19 +14012,8 @@
                 <w:sz w:val="32"/>
                 <w:szCs w:val="40"/>
               </w:rPr>
-              <w:t>)</w:t>
-            </w:r>
-            <w:proofErr w:type="gramStart"/>
-            <w:r>
-              <w:rPr>
-                <w:rFonts w:ascii="BRH Devanagari Extra" w:hAnsi="BRH Devanagari Extra" w:cs="BRH Devanagari Extra"/>
-                <w:color w:val="000000"/>
-                <w:sz w:val="32"/>
-                <w:szCs w:val="40"/>
-              </w:rPr>
-              <w:t>-  lÉÑ</w:t>
-            </w:r>
-            <w:proofErr w:type="gramEnd"/>
+              <w:t>)-  lÉÑ</w:t>
+            </w:r>
             <w:r>
               <w:rPr>
                 <w:rFonts w:ascii="BRH Malayalam Extra" w:hAnsi="BRH Malayalam Extra" w:cs="BRH Devanagari Extra"/>
@@ -13845,19 +14605,8 @@
                 <w:sz w:val="32"/>
                 <w:szCs w:val="40"/>
               </w:rPr>
-              <w:t>)</w:t>
-            </w:r>
-            <w:proofErr w:type="gramStart"/>
-            <w:r>
-              <w:rPr>
-                <w:rFonts w:ascii="BRH Devanagari Extra" w:hAnsi="BRH Devanagari Extra" w:cs="BRH Devanagari Extra"/>
-                <w:color w:val="000000"/>
-                <w:sz w:val="32"/>
-                <w:szCs w:val="40"/>
-              </w:rPr>
-              <w:t>-  E</w:t>
-            </w:r>
-            <w:proofErr w:type="gramEnd"/>
+              <w:t>)-  E</w:t>
+            </w:r>
             <w:r>
               <w:rPr>
                 <w:rFonts w:ascii="BRH Malayalam Extra" w:hAnsi="BRH Malayalam Extra" w:cs="BRH Devanagari Extra"/>
@@ -14142,6 +14891,7 @@
                 <w:sz w:val="32"/>
                 <w:szCs w:val="40"/>
               </w:rPr>
+              <w:lastRenderedPageBreak/>
               <w:t>rÉÉ</w:t>
             </w:r>
             <w:r>
@@ -14339,7 +15089,6 @@
                 <w:color w:val="000000"/>
                 <w:szCs w:val="40"/>
               </w:rPr>
-              <w:lastRenderedPageBreak/>
               <w:t>59</w:t>
             </w:r>
             <w:r>
@@ -14443,19 +15192,8 @@
                 <w:sz w:val="32"/>
                 <w:szCs w:val="40"/>
               </w:rPr>
-              <w:t>)</w:t>
-            </w:r>
-            <w:proofErr w:type="gramStart"/>
-            <w:r>
-              <w:rPr>
-                <w:rFonts w:ascii="BRH Devanagari Extra" w:hAnsi="BRH Devanagari Extra" w:cs="BRH Devanagari Extra"/>
-                <w:color w:val="000000"/>
-                <w:sz w:val="32"/>
-                <w:szCs w:val="40"/>
-              </w:rPr>
-              <w:t>-  E</w:t>
-            </w:r>
-            <w:proofErr w:type="gramEnd"/>
+              <w:t>)-  E</w:t>
+            </w:r>
             <w:r>
               <w:rPr>
                 <w:rFonts w:ascii="BRH Malayalam Extra" w:hAnsi="BRH Malayalam Extra" w:cs="BRH Devanagari Extra"/>
@@ -14734,27 +15472,7 @@
                 <w:sz w:val="32"/>
                 <w:szCs w:val="40"/>
               </w:rPr>
-              <w:t>)</w:t>
-            </w:r>
-            <w:proofErr w:type="gramStart"/>
-            <w:r>
-              <w:rPr>
-                <w:rFonts w:ascii="BRH Devanagari Extra" w:hAnsi="BRH Devanagari Extra" w:cs="BRH Devanagari Extra"/>
-                <w:color w:val="000000"/>
-                <w:sz w:val="32"/>
-                <w:szCs w:val="40"/>
-              </w:rPr>
-              <w:t>-  mÉëÌiÉþ</w:t>
-            </w:r>
-            <w:proofErr w:type="gramEnd"/>
-            <w:r>
-              <w:rPr>
-                <w:rFonts w:ascii="BRH Devanagari Extra" w:hAnsi="BRH Devanagari Extra" w:cs="BRH Devanagari Extra"/>
-                <w:color w:val="000000"/>
-                <w:sz w:val="32"/>
-                <w:szCs w:val="40"/>
-              </w:rPr>
-              <w:t xml:space="preserve"> | lÉÑ</w:t>
+              <w:t>)-  mÉëÌiÉþ | lÉÑ</w:t>
             </w:r>
             <w:r>
               <w:rPr>
@@ -15245,19 +15963,8 @@
                 <w:sz w:val="32"/>
                 <w:szCs w:val="40"/>
               </w:rPr>
-              <w:t>)</w:t>
-            </w:r>
-            <w:proofErr w:type="gramStart"/>
-            <w:r>
-              <w:rPr>
-                <w:rFonts w:ascii="BRH Devanagari Extra" w:hAnsi="BRH Devanagari Extra" w:cs="BRH Devanagari Extra"/>
-                <w:color w:val="000000"/>
-                <w:sz w:val="32"/>
-                <w:szCs w:val="40"/>
-              </w:rPr>
-              <w:t>-  lÉÑ</w:t>
-            </w:r>
-            <w:proofErr w:type="gramEnd"/>
+              <w:t>)-  lÉÑ</w:t>
+            </w:r>
             <w:r>
               <w:rPr>
                 <w:rFonts w:ascii="BRH Malayalam Extra" w:hAnsi="BRH Malayalam Extra" w:cs="BRH Devanagari Extra"/>
@@ -15991,19 +16698,8 @@
                 <w:sz w:val="32"/>
                 <w:szCs w:val="40"/>
               </w:rPr>
-              <w:t>)</w:t>
-            </w:r>
-            <w:proofErr w:type="gramStart"/>
-            <w:r>
-              <w:rPr>
-                <w:rFonts w:ascii="BRH Devanagari Extra" w:hAnsi="BRH Devanagari Extra" w:cs="BRH Devanagari Extra"/>
-                <w:color w:val="000000"/>
-                <w:sz w:val="32"/>
-                <w:szCs w:val="40"/>
-              </w:rPr>
-              <w:t>-  mÉÑ</w:t>
-            </w:r>
-            <w:proofErr w:type="gramEnd"/>
+              <w:t>)-  mÉÑ</w:t>
+            </w:r>
             <w:r>
               <w:rPr>
                 <w:rFonts w:ascii="BRH Malayalam Extra" w:hAnsi="BRH Malayalam Extra" w:cs="BRH Devanagari Extra"/>
@@ -16364,6 +17060,7 @@
                 <w:sz w:val="32"/>
                 <w:szCs w:val="40"/>
               </w:rPr>
+              <w:lastRenderedPageBreak/>
               <w:t>mÉÑ</w:t>
             </w:r>
             <w:r>
@@ -16753,19 +17450,8 @@
                 <w:sz w:val="32"/>
                 <w:szCs w:val="40"/>
               </w:rPr>
-              <w:t>)</w:t>
-            </w:r>
-            <w:proofErr w:type="gramStart"/>
-            <w:r>
-              <w:rPr>
-                <w:rFonts w:ascii="BRH Devanagari Extra" w:hAnsi="BRH Devanagari Extra" w:cs="BRH Devanagari Extra"/>
-                <w:color w:val="000000"/>
-                <w:sz w:val="32"/>
-                <w:szCs w:val="40"/>
-              </w:rPr>
-              <w:t>-  mÉÑ</w:t>
-            </w:r>
-            <w:proofErr w:type="gramEnd"/>
+              <w:t>)-  mÉÑ</w:t>
+            </w:r>
             <w:r>
               <w:rPr>
                 <w:rFonts w:ascii="BRH Malayalam Extra" w:hAnsi="BRH Malayalam Extra" w:cs="BRH Devanagari Extra"/>
@@ -16832,7 +17518,6 @@
                 <w:sz w:val="32"/>
                 <w:szCs w:val="40"/>
               </w:rPr>
-              <w:lastRenderedPageBreak/>
               <w:t>mÉÑ</w:t>
             </w:r>
             <w:r>
@@ -17063,27 +17748,7 @@
                 <w:sz w:val="32"/>
                 <w:szCs w:val="40"/>
               </w:rPr>
-              <w:t>)</w:t>
-            </w:r>
-            <w:proofErr w:type="gramStart"/>
-            <w:r>
-              <w:rPr>
-                <w:rFonts w:ascii="BRH Devanagari Extra" w:hAnsi="BRH Devanagari Extra" w:cs="BRH Devanagari Extra"/>
-                <w:color w:val="000000"/>
-                <w:sz w:val="32"/>
-                <w:szCs w:val="40"/>
-              </w:rPr>
-              <w:t>-  mÉëÌiÉþ</w:t>
-            </w:r>
-            <w:proofErr w:type="gramEnd"/>
-            <w:r>
-              <w:rPr>
-                <w:rFonts w:ascii="BRH Devanagari Extra" w:hAnsi="BRH Devanagari Extra" w:cs="BRH Devanagari Extra"/>
-                <w:color w:val="000000"/>
-                <w:sz w:val="32"/>
-                <w:szCs w:val="40"/>
-              </w:rPr>
-              <w:t xml:space="preserve"> | lÉÑ</w:t>
+              <w:t>)-  mÉëÌiÉþ | lÉÑ</w:t>
             </w:r>
             <w:r>
               <w:rPr>
@@ -17525,19 +18190,8 @@
                 <w:sz w:val="32"/>
                 <w:szCs w:val="40"/>
               </w:rPr>
-              <w:t>)</w:t>
-            </w:r>
-            <w:proofErr w:type="gramStart"/>
-            <w:r>
-              <w:rPr>
-                <w:rFonts w:ascii="BRH Devanagari Extra" w:hAnsi="BRH Devanagari Extra" w:cs="BRH Devanagari Extra"/>
-                <w:color w:val="000000"/>
-                <w:sz w:val="32"/>
-                <w:szCs w:val="40"/>
-              </w:rPr>
-              <w:t>-  lÉÑ</w:t>
-            </w:r>
-            <w:proofErr w:type="gramEnd"/>
+              <w:t>)-  lÉÑ</w:t>
+            </w:r>
             <w:r>
               <w:rPr>
                 <w:rFonts w:ascii="BRH Malayalam Extra" w:hAnsi="BRH Malayalam Extra" w:cs="BRH Devanagari Extra"/>
@@ -18223,19 +18877,8 @@
                 <w:sz w:val="32"/>
                 <w:szCs w:val="40"/>
               </w:rPr>
-              <w:t>)</w:t>
-            </w:r>
-            <w:proofErr w:type="gramStart"/>
-            <w:r>
-              <w:rPr>
-                <w:rFonts w:ascii="BRH Devanagari Extra" w:hAnsi="BRH Devanagari Extra" w:cs="BRH Devanagari Extra"/>
-                <w:color w:val="000000"/>
-                <w:sz w:val="32"/>
-                <w:szCs w:val="40"/>
-              </w:rPr>
-              <w:t>-  mÉÑ</w:t>
-            </w:r>
-            <w:proofErr w:type="gramEnd"/>
+              <w:t>)-  mÉÑ</w:t>
+            </w:r>
             <w:r>
               <w:rPr>
                 <w:rFonts w:ascii="BRH Malayalam Extra" w:hAnsi="BRH Malayalam Extra" w:cs="BRH Devanagari Extra"/>
@@ -18562,6 +19205,7 @@
                 <w:sz w:val="32"/>
                 <w:szCs w:val="40"/>
               </w:rPr>
+              <w:lastRenderedPageBreak/>
               <w:t>mÉÑ</w:t>
             </w:r>
             <w:r>
@@ -18909,19 +19553,8 @@
                 <w:sz w:val="32"/>
                 <w:szCs w:val="40"/>
               </w:rPr>
-              <w:t>)</w:t>
-            </w:r>
-            <w:proofErr w:type="gramStart"/>
-            <w:r>
-              <w:rPr>
-                <w:rFonts w:ascii="BRH Devanagari Extra" w:hAnsi="BRH Devanagari Extra" w:cs="BRH Devanagari Extra"/>
-                <w:color w:val="000000"/>
-                <w:sz w:val="32"/>
-                <w:szCs w:val="40"/>
-              </w:rPr>
-              <w:t>-  mÉÑ</w:t>
-            </w:r>
-            <w:proofErr w:type="gramEnd"/>
+              <w:t>)-  mÉÑ</w:t>
+            </w:r>
             <w:r>
               <w:rPr>
                 <w:rFonts w:ascii="BRH Malayalam Extra" w:hAnsi="BRH Malayalam Extra" w:cs="BRH Devanagari Extra"/>
@@ -18980,7 +19613,6 @@
                 <w:sz w:val="32"/>
                 <w:szCs w:val="40"/>
               </w:rPr>
-              <w:lastRenderedPageBreak/>
               <w:t>mÉÑ</w:t>
             </w:r>
             <w:r>
@@ -19216,27 +19848,7 @@
                 <w:sz w:val="32"/>
                 <w:szCs w:val="40"/>
               </w:rPr>
-              <w:t>)</w:t>
-            </w:r>
-            <w:proofErr w:type="gramStart"/>
-            <w:r>
-              <w:rPr>
-                <w:rFonts w:ascii="BRH Devanagari Extra" w:hAnsi="BRH Devanagari Extra" w:cs="BRH Devanagari Extra"/>
-                <w:color w:val="000000"/>
-                <w:sz w:val="32"/>
-                <w:szCs w:val="40"/>
-              </w:rPr>
-              <w:t>-  erÉÉåÌiÉþÈ</w:t>
-            </w:r>
-            <w:proofErr w:type="gramEnd"/>
-            <w:r>
-              <w:rPr>
-                <w:rFonts w:ascii="BRH Devanagari Extra" w:hAnsi="BRH Devanagari Extra" w:cs="BRH Devanagari Extra"/>
-                <w:color w:val="000000"/>
-                <w:sz w:val="32"/>
-                <w:szCs w:val="40"/>
-              </w:rPr>
-              <w:t xml:space="preserve"> | kÉ</w:t>
+              <w:t>)-  erÉÉåÌiÉþÈ | kÉ</w:t>
             </w:r>
             <w:r>
               <w:rPr>
@@ -19694,19 +20306,8 @@
                 <w:sz w:val="32"/>
                 <w:szCs w:val="40"/>
               </w:rPr>
-              <w:t>)</w:t>
-            </w:r>
-            <w:proofErr w:type="gramStart"/>
-            <w:r>
-              <w:rPr>
-                <w:rFonts w:ascii="BRH Devanagari Extra" w:hAnsi="BRH Devanagari Extra" w:cs="BRH Devanagari Extra"/>
-                <w:color w:val="000000"/>
-                <w:sz w:val="32"/>
-                <w:szCs w:val="40"/>
-              </w:rPr>
-              <w:t>-  kÉ</w:t>
-            </w:r>
-            <w:proofErr w:type="gramEnd"/>
+              <w:t>)-  kÉ</w:t>
+            </w:r>
             <w:r>
               <w:rPr>
                 <w:rFonts w:ascii="BRH Malayalam Extra" w:hAnsi="BRH Malayalam Extra" w:cs="BRH Devanagari Extra"/>
@@ -20338,19 +20939,8 @@
                 <w:sz w:val="32"/>
                 <w:szCs w:val="40"/>
               </w:rPr>
-              <w:t>)</w:t>
-            </w:r>
-            <w:proofErr w:type="gramStart"/>
-            <w:r>
-              <w:rPr>
-                <w:rFonts w:ascii="BRH Devanagari Extra" w:hAnsi="BRH Devanagari Extra" w:cs="BRH Devanagari Extra"/>
-                <w:color w:val="000000"/>
-                <w:sz w:val="32"/>
-                <w:szCs w:val="40"/>
-              </w:rPr>
-              <w:t>-  E</w:t>
-            </w:r>
-            <w:proofErr w:type="gramEnd"/>
+              <w:t>)-  E</w:t>
+            </w:r>
             <w:r>
               <w:rPr>
                 <w:rFonts w:ascii="BRH Malayalam Extra" w:hAnsi="BRH Malayalam Extra" w:cs="BRH Devanagari Extra"/>
@@ -20807,7 +21397,17 @@
                 <w:sz w:val="32"/>
                 <w:szCs w:val="40"/>
               </w:rPr>
-              <w:t>¤qÉÉ rÉÉ</w:t>
+              <w:t xml:space="preserve">¤qÉÉ </w:t>
+            </w:r>
+            <w:r>
+              <w:rPr>
+                <w:rFonts w:ascii="BRH Devanagari Extra" w:hAnsi="BRH Devanagari Extra" w:cs="BRH Devanagari Extra"/>
+                <w:color w:val="000000"/>
+                <w:sz w:val="32"/>
+                <w:szCs w:val="40"/>
+              </w:rPr>
+              <w:lastRenderedPageBreak/>
+              <w:t>rÉÉ</w:t>
             </w:r>
             <w:r>
               <w:rPr>
@@ -20950,19 +21550,8 @@
                 <w:sz w:val="32"/>
                 <w:szCs w:val="40"/>
               </w:rPr>
-              <w:t>)</w:t>
-            </w:r>
-            <w:proofErr w:type="gramStart"/>
-            <w:r>
-              <w:rPr>
-                <w:rFonts w:ascii="BRH Devanagari Extra" w:hAnsi="BRH Devanagari Extra" w:cs="BRH Devanagari Extra"/>
-                <w:color w:val="000000"/>
-                <w:sz w:val="32"/>
-                <w:szCs w:val="40"/>
-              </w:rPr>
-              <w:t>-  E</w:t>
-            </w:r>
-            <w:proofErr w:type="gramEnd"/>
+              <w:t>)-  E</w:t>
+            </w:r>
             <w:r>
               <w:rPr>
                 <w:rFonts w:ascii="BRH Malayalam Extra" w:hAnsi="BRH Malayalam Extra" w:cs="BRH Devanagari Extra"/>
@@ -21140,6 +21729,7 @@
                 <w:color w:val="000000"/>
                 <w:szCs w:val="40"/>
               </w:rPr>
+              <w:lastRenderedPageBreak/>
               <w:t>14</w:t>
             </w:r>
             <w:r>
@@ -21243,27 +21833,7 @@
                 <w:sz w:val="32"/>
                 <w:szCs w:val="40"/>
               </w:rPr>
-              <w:t>)</w:t>
-            </w:r>
-            <w:proofErr w:type="gramStart"/>
-            <w:r>
-              <w:rPr>
-                <w:rFonts w:ascii="BRH Devanagari Extra" w:hAnsi="BRH Devanagari Extra" w:cs="BRH Devanagari Extra"/>
-                <w:color w:val="000000"/>
-                <w:sz w:val="32"/>
-                <w:szCs w:val="40"/>
-              </w:rPr>
-              <w:t>-  erÉÉåÌiÉþÈ</w:t>
-            </w:r>
-            <w:proofErr w:type="gramEnd"/>
-            <w:r>
-              <w:rPr>
-                <w:rFonts w:ascii="BRH Devanagari Extra" w:hAnsi="BRH Devanagari Extra" w:cs="BRH Devanagari Extra"/>
-                <w:color w:val="000000"/>
-                <w:sz w:val="32"/>
-                <w:szCs w:val="40"/>
-              </w:rPr>
-              <w:t xml:space="preserve"> | kÉ</w:t>
+              <w:t>)-  erÉÉåÌiÉþÈ | kÉ</w:t>
             </w:r>
             <w:r>
               <w:rPr>
@@ -21713,19 +22283,8 @@
                 <w:sz w:val="32"/>
                 <w:szCs w:val="40"/>
               </w:rPr>
-              <w:t>)</w:t>
-            </w:r>
-            <w:proofErr w:type="gramStart"/>
-            <w:r>
-              <w:rPr>
-                <w:rFonts w:ascii="BRH Devanagari Extra" w:hAnsi="BRH Devanagari Extra" w:cs="BRH Devanagari Extra"/>
-                <w:color w:val="000000"/>
-                <w:sz w:val="32"/>
-                <w:szCs w:val="40"/>
-              </w:rPr>
-              <w:t>-  kÉ</w:t>
-            </w:r>
-            <w:proofErr w:type="gramEnd"/>
+              <w:t>)-  kÉ</w:t>
+            </w:r>
             <w:r>
               <w:rPr>
                 <w:rFonts w:ascii="BRH Malayalam Extra" w:hAnsi="BRH Malayalam Extra" w:cs="BRH Devanagari Extra"/>
@@ -22281,19 +22840,8 @@
                 <w:sz w:val="32"/>
                 <w:szCs w:val="40"/>
               </w:rPr>
-              <w:t>)</w:t>
-            </w:r>
-            <w:proofErr w:type="gramStart"/>
-            <w:r>
-              <w:rPr>
-                <w:rFonts w:ascii="BRH Devanagari Extra" w:hAnsi="BRH Devanagari Extra" w:cs="BRH Devanagari Extra"/>
-                <w:color w:val="000000"/>
-                <w:sz w:val="32"/>
-                <w:szCs w:val="40"/>
-              </w:rPr>
-              <w:t>-  E</w:t>
-            </w:r>
-            <w:proofErr w:type="gramEnd"/>
+              <w:t>)-  E</w:t>
+            </w:r>
             <w:r>
               <w:rPr>
                 <w:rFonts w:ascii="BRH Malayalam Extra" w:hAnsi="BRH Malayalam Extra" w:cs="BRH Devanagari Extra"/>
@@ -22743,6 +23291,7 @@
                 <w:sz w:val="32"/>
                 <w:szCs w:val="40"/>
               </w:rPr>
+              <w:lastRenderedPageBreak/>
               <w:t>rÉÉ</w:t>
             </w:r>
             <w:r>
@@ -22886,19 +23435,8 @@
                 <w:sz w:val="32"/>
                 <w:szCs w:val="40"/>
               </w:rPr>
-              <w:t>)</w:t>
-            </w:r>
-            <w:proofErr w:type="gramStart"/>
-            <w:r>
-              <w:rPr>
-                <w:rFonts w:ascii="BRH Devanagari Extra" w:hAnsi="BRH Devanagari Extra" w:cs="BRH Devanagari Extra"/>
-                <w:color w:val="000000"/>
-                <w:sz w:val="32"/>
-                <w:szCs w:val="40"/>
-              </w:rPr>
-              <w:t>-  E</w:t>
-            </w:r>
-            <w:proofErr w:type="gramEnd"/>
+              <w:t>)-  E</w:t>
+            </w:r>
             <w:r>
               <w:rPr>
                 <w:rFonts w:ascii="BRH Malayalam Extra" w:hAnsi="BRH Malayalam Extra" w:cs="BRH Devanagari Extra"/>
@@ -23177,19 +23715,8 @@
                 <w:sz w:val="32"/>
                 <w:szCs w:val="40"/>
               </w:rPr>
-              <w:t>)</w:t>
-            </w:r>
-            <w:proofErr w:type="gramStart"/>
-            <w:r>
-              <w:rPr>
-                <w:rFonts w:ascii="BRH Devanagari Extra" w:hAnsi="BRH Devanagari Extra" w:cs="BRH Devanagari Extra"/>
-                <w:color w:val="000000"/>
-                <w:sz w:val="32"/>
-                <w:szCs w:val="40"/>
-              </w:rPr>
-              <w:t>-  L</w:t>
-            </w:r>
-            <w:proofErr w:type="gramEnd"/>
+              <w:t>)-  L</w:t>
+            </w:r>
             <w:r>
               <w:rPr>
                 <w:rFonts w:ascii="BRH Malayalam Extra" w:hAnsi="BRH Malayalam Extra" w:cs="BRH Devanagari Extra"/>
@@ -23677,27 +24204,7 @@
                 <w:sz w:val="32"/>
                 <w:szCs w:val="40"/>
               </w:rPr>
-              <w:t>)</w:t>
-            </w:r>
-            <w:proofErr w:type="gramStart"/>
-            <w:r>
-              <w:rPr>
-                <w:rFonts w:ascii="BRH Devanagari Extra" w:hAnsi="BRH Devanagari Extra" w:cs="BRH Devanagari Extra"/>
-                <w:color w:val="000000"/>
-                <w:sz w:val="32"/>
-                <w:szCs w:val="40"/>
-              </w:rPr>
-              <w:t>-  uÉåSþ</w:t>
-            </w:r>
-            <w:proofErr w:type="gramEnd"/>
-            <w:r>
-              <w:rPr>
-                <w:rFonts w:ascii="BRH Devanagari Extra" w:hAnsi="BRH Devanagari Extra" w:cs="BRH Devanagari Extra"/>
-                <w:color w:val="000000"/>
-                <w:sz w:val="32"/>
-                <w:szCs w:val="40"/>
-              </w:rPr>
-              <w:t xml:space="preserve"> | mÉÑ</w:t>
+              <w:t>)-  uÉåSþ | mÉÑ</w:t>
             </w:r>
             <w:r>
               <w:rPr>
@@ -24327,19 +24834,8 @@
                 <w:sz w:val="32"/>
                 <w:szCs w:val="40"/>
               </w:rPr>
-              <w:t>)</w:t>
-            </w:r>
-            <w:proofErr w:type="gramStart"/>
-            <w:r>
-              <w:rPr>
-                <w:rFonts w:ascii="BRH Devanagari Extra" w:hAnsi="BRH Devanagari Extra" w:cs="BRH Devanagari Extra"/>
-                <w:color w:val="000000"/>
-                <w:sz w:val="32"/>
-                <w:szCs w:val="40"/>
-              </w:rPr>
-              <w:t>-  mÉÑ</w:t>
-            </w:r>
-            <w:proofErr w:type="gramEnd"/>
+              <w:t>)-  mÉÑ</w:t>
+            </w:r>
             <w:r>
               <w:rPr>
                 <w:rFonts w:ascii="BRH Malayalam Extra" w:hAnsi="BRH Malayalam Extra" w:cs="BRH Devanagari Extra"/>
@@ -24699,6 +25195,7 @@
                 <w:sz w:val="32"/>
                 <w:szCs w:val="40"/>
               </w:rPr>
+              <w:lastRenderedPageBreak/>
               <w:t>mÉÑ</w:t>
             </w:r>
             <w:r>
@@ -25088,19 +25585,8 @@
                 <w:sz w:val="32"/>
                 <w:szCs w:val="40"/>
               </w:rPr>
-              <w:t>)</w:t>
-            </w:r>
-            <w:proofErr w:type="gramStart"/>
-            <w:r>
-              <w:rPr>
-                <w:rFonts w:ascii="BRH Devanagari Extra" w:hAnsi="BRH Devanagari Extra" w:cs="BRH Devanagari Extra"/>
-                <w:color w:val="000000"/>
-                <w:sz w:val="32"/>
-                <w:szCs w:val="40"/>
-              </w:rPr>
-              <w:t>-  mÉÑ</w:t>
-            </w:r>
-            <w:proofErr w:type="gramEnd"/>
+              <w:t>)-  mÉÑ</w:t>
+            </w:r>
             <w:r>
               <w:rPr>
                 <w:rFonts w:ascii="BRH Malayalam Extra" w:hAnsi="BRH Malayalam Extra" w:cs="BRH Devanagari Extra"/>
@@ -25302,6 +25788,7 @@
                 <w:color w:val="000000"/>
                 <w:szCs w:val="40"/>
               </w:rPr>
+              <w:lastRenderedPageBreak/>
               <w:t>30</w:t>
             </w:r>
             <w:r>
@@ -25405,19 +25892,8 @@
                 <w:sz w:val="32"/>
                 <w:szCs w:val="40"/>
               </w:rPr>
-              <w:t>)</w:t>
-            </w:r>
-            <w:proofErr w:type="gramStart"/>
-            <w:r>
-              <w:rPr>
-                <w:rFonts w:ascii="BRH Devanagari Extra" w:hAnsi="BRH Devanagari Extra" w:cs="BRH Devanagari Extra"/>
-                <w:color w:val="000000"/>
-                <w:sz w:val="32"/>
-                <w:szCs w:val="40"/>
-              </w:rPr>
-              <w:t>-  L</w:t>
-            </w:r>
-            <w:proofErr w:type="gramEnd"/>
+              <w:t>)-  L</w:t>
+            </w:r>
             <w:r>
               <w:rPr>
                 <w:rFonts w:ascii="BRH Malayalam Extra" w:hAnsi="BRH Malayalam Extra" w:cs="BRH Devanagari Extra"/>
@@ -25872,27 +26348,7 @@
                 <w:sz w:val="32"/>
                 <w:szCs w:val="40"/>
               </w:rPr>
-              <w:t>)</w:t>
-            </w:r>
-            <w:proofErr w:type="gramStart"/>
-            <w:r>
-              <w:rPr>
-                <w:rFonts w:ascii="BRH Devanagari Extra" w:hAnsi="BRH Devanagari Extra" w:cs="BRH Devanagari Extra"/>
-                <w:color w:val="000000"/>
-                <w:sz w:val="32"/>
-                <w:szCs w:val="40"/>
-              </w:rPr>
-              <w:t>-  uÉåSþ</w:t>
-            </w:r>
-            <w:proofErr w:type="gramEnd"/>
-            <w:r>
-              <w:rPr>
-                <w:rFonts w:ascii="BRH Devanagari Extra" w:hAnsi="BRH Devanagari Extra" w:cs="BRH Devanagari Extra"/>
-                <w:color w:val="000000"/>
-                <w:sz w:val="32"/>
-                <w:szCs w:val="40"/>
-              </w:rPr>
-              <w:t xml:space="preserve"> | mÉÑ</w:t>
+              <w:t>)-  uÉåSþ | mÉÑ</w:t>
             </w:r>
             <w:r>
               <w:rPr>
@@ -26477,19 +26933,8 @@
                 <w:sz w:val="32"/>
                 <w:szCs w:val="40"/>
               </w:rPr>
-              <w:t>)</w:t>
-            </w:r>
-            <w:proofErr w:type="gramStart"/>
-            <w:r>
-              <w:rPr>
-                <w:rFonts w:ascii="BRH Devanagari Extra" w:hAnsi="BRH Devanagari Extra" w:cs="BRH Devanagari Extra"/>
-                <w:color w:val="000000"/>
-                <w:sz w:val="32"/>
-                <w:szCs w:val="40"/>
-              </w:rPr>
-              <w:t>-  mÉÑ</w:t>
-            </w:r>
-            <w:proofErr w:type="gramEnd"/>
+              <w:t>)-  mÉÑ</w:t>
+            </w:r>
             <w:r>
               <w:rPr>
                 <w:rFonts w:ascii="BRH Malayalam Extra" w:hAnsi="BRH Malayalam Extra" w:cs="BRH Devanagari Extra"/>
@@ -26825,6 +27270,7 @@
                 <w:sz w:val="32"/>
                 <w:szCs w:val="40"/>
               </w:rPr>
+              <w:lastRenderedPageBreak/>
               <w:t>mÉÑ</w:t>
             </w:r>
             <w:r>
@@ -27182,19 +27628,8 @@
                 <w:sz w:val="32"/>
                 <w:szCs w:val="40"/>
               </w:rPr>
-              <w:t>)</w:t>
-            </w:r>
-            <w:proofErr w:type="gramStart"/>
-            <w:r>
-              <w:rPr>
-                <w:rFonts w:ascii="BRH Devanagari Extra" w:hAnsi="BRH Devanagari Extra" w:cs="BRH Devanagari Extra"/>
-                <w:color w:val="000000"/>
-                <w:sz w:val="32"/>
-                <w:szCs w:val="40"/>
-              </w:rPr>
-              <w:t>-  mÉÑ</w:t>
-            </w:r>
-            <w:proofErr w:type="gramEnd"/>
+              <w:t>)-  mÉÑ</w:t>
+            </w:r>
             <w:r>
               <w:rPr>
                 <w:rFonts w:ascii="BRH Malayalam Extra" w:hAnsi="BRH Malayalam Extra" w:cs="BRH Devanagari Extra"/>
@@ -27498,19 +27933,8 @@
                 <w:sz w:val="32"/>
                 <w:szCs w:val="40"/>
               </w:rPr>
-              <w:t>)</w:t>
-            </w:r>
-            <w:proofErr w:type="gramStart"/>
-            <w:r>
-              <w:rPr>
-                <w:rFonts w:ascii="BRH Devanagari Extra" w:hAnsi="BRH Devanagari Extra" w:cs="BRH Devanagari Extra"/>
-                <w:color w:val="000000"/>
-                <w:sz w:val="32"/>
-                <w:szCs w:val="40"/>
-              </w:rPr>
-              <w:t>-  A</w:t>
-            </w:r>
-            <w:proofErr w:type="gramEnd"/>
+              <w:t>)-  A</w:t>
+            </w:r>
             <w:r>
               <w:rPr>
                 <w:rFonts w:ascii="BRH Malayalam Extra" w:hAnsi="BRH Malayalam Extra" w:cs="BRH Devanagari Extra"/>
@@ -28101,19 +28525,8 @@
                 <w:sz w:val="32"/>
                 <w:szCs w:val="40"/>
               </w:rPr>
-              <w:t>)</w:t>
-            </w:r>
-            <w:proofErr w:type="gramStart"/>
-            <w:r>
-              <w:rPr>
-                <w:rFonts w:ascii="BRH Devanagari Extra" w:hAnsi="BRH Devanagari Extra" w:cs="BRH Devanagari Extra"/>
-                <w:color w:val="000000"/>
-                <w:sz w:val="32"/>
-                <w:szCs w:val="40"/>
-              </w:rPr>
-              <w:t>-  pÉÑ</w:t>
-            </w:r>
-            <w:proofErr w:type="gramEnd"/>
+              <w:t>)-  pÉÑ</w:t>
+            </w:r>
             <w:r>
               <w:rPr>
                 <w:rFonts w:ascii="BRH Malayalam Extra" w:hAnsi="BRH Malayalam Extra" w:cs="BRH Devanagari Extra"/>
@@ -28568,7 +28981,17 @@
                 <w:sz w:val="32"/>
                 <w:szCs w:val="40"/>
               </w:rPr>
-              <w:t>ÑþlÉÌ£ü pÉÑlÉYirÉÑ</w:t>
+              <w:t xml:space="preserve">ÑþlÉÌ£ü </w:t>
+            </w:r>
+            <w:r>
+              <w:rPr>
+                <w:rFonts w:ascii="BRH Devanagari Extra" w:hAnsi="BRH Devanagari Extra" w:cs="BRH Devanagari Extra"/>
+                <w:color w:val="000000"/>
+                <w:sz w:val="32"/>
+                <w:szCs w:val="40"/>
+              </w:rPr>
+              <w:lastRenderedPageBreak/>
+              <w:t>pÉÑlÉYirÉÑ</w:t>
             </w:r>
             <w:r>
               <w:rPr>
@@ -28755,19 +29178,8 @@
                 <w:sz w:val="32"/>
                 <w:szCs w:val="40"/>
               </w:rPr>
-              <w:t>)</w:t>
-            </w:r>
-            <w:proofErr w:type="gramStart"/>
-            <w:r>
-              <w:rPr>
-                <w:rFonts w:ascii="BRH Devanagari Extra" w:hAnsi="BRH Devanagari Extra" w:cs="BRH Devanagari Extra"/>
-                <w:color w:val="000000"/>
-                <w:sz w:val="32"/>
-                <w:szCs w:val="40"/>
-              </w:rPr>
-              <w:t>-  E</w:t>
-            </w:r>
-            <w:proofErr w:type="gramEnd"/>
+              <w:t>)-  E</w:t>
+            </w:r>
             <w:r>
               <w:rPr>
                 <w:rFonts w:ascii="BRH Malayalam Extra" w:hAnsi="BRH Malayalam Extra" w:cs="BRH Devanagari Extra"/>
@@ -29344,19 +29756,8 @@
                 <w:sz w:val="32"/>
                 <w:szCs w:val="40"/>
               </w:rPr>
-              <w:t>)</w:t>
-            </w:r>
-            <w:proofErr w:type="gramStart"/>
-            <w:r>
-              <w:rPr>
-                <w:rFonts w:ascii="BRH Devanagari Extra" w:hAnsi="BRH Devanagari Extra" w:cs="BRH Devanagari Extra"/>
-                <w:color w:val="000000"/>
-                <w:sz w:val="32"/>
-                <w:szCs w:val="40"/>
-              </w:rPr>
-              <w:t>-  E</w:t>
-            </w:r>
-            <w:proofErr w:type="gramEnd"/>
+              <w:t>)-  E</w:t>
+            </w:r>
             <w:r>
               <w:rPr>
                 <w:rFonts w:ascii="BRH Malayalam Extra" w:hAnsi="BRH Malayalam Extra" w:cs="BRH Devanagari Extra"/>
@@ -29534,6 +29935,7 @@
                 <w:color w:val="000000"/>
                 <w:szCs w:val="40"/>
               </w:rPr>
+              <w:lastRenderedPageBreak/>
               <w:t>40</w:t>
             </w:r>
             <w:r>
@@ -29637,19 +30039,8 @@
                 <w:sz w:val="32"/>
                 <w:szCs w:val="40"/>
               </w:rPr>
-              <w:t>)</w:t>
-            </w:r>
-            <w:proofErr w:type="gramStart"/>
-            <w:r>
-              <w:rPr>
-                <w:rFonts w:ascii="BRH Devanagari Extra" w:hAnsi="BRH Devanagari Extra" w:cs="BRH Devanagari Extra"/>
-                <w:color w:val="000000"/>
-                <w:sz w:val="32"/>
-                <w:szCs w:val="40"/>
-              </w:rPr>
-              <w:t>-  A</w:t>
-            </w:r>
-            <w:proofErr w:type="gramEnd"/>
+              <w:t>)-  A</w:t>
+            </w:r>
             <w:r>
               <w:rPr>
                 <w:rFonts w:ascii="BRH Malayalam Extra" w:hAnsi="BRH Malayalam Extra" w:cs="BRH Devanagari Extra"/>
@@ -30183,19 +30574,8 @@
                 <w:sz w:val="32"/>
                 <w:szCs w:val="40"/>
               </w:rPr>
-              <w:t>)</w:t>
-            </w:r>
-            <w:proofErr w:type="gramStart"/>
-            <w:r>
-              <w:rPr>
-                <w:rFonts w:ascii="BRH Devanagari Extra" w:hAnsi="BRH Devanagari Extra" w:cs="BRH Devanagari Extra"/>
-                <w:color w:val="000000"/>
-                <w:sz w:val="32"/>
-                <w:szCs w:val="40"/>
-              </w:rPr>
-              <w:t>-  pÉÑ</w:t>
-            </w:r>
-            <w:proofErr w:type="gramEnd"/>
+              <w:t>)-  pÉÑ</w:t>
+            </w:r>
             <w:r>
               <w:rPr>
                 <w:rFonts w:ascii="BRH Malayalam Extra" w:hAnsi="BRH Malayalam Extra" w:cs="BRH Devanagari Extra"/>
@@ -30641,6 +31021,7 @@
                 <w:sz w:val="32"/>
                 <w:szCs w:val="40"/>
               </w:rPr>
+              <w:lastRenderedPageBreak/>
               <w:t>pÉÑlÉYirÉÑ</w:t>
             </w:r>
             <w:r>
@@ -30820,19 +31201,8 @@
                 <w:sz w:val="32"/>
                 <w:szCs w:val="40"/>
               </w:rPr>
-              <w:t>)</w:t>
-            </w:r>
-            <w:proofErr w:type="gramStart"/>
-            <w:r>
-              <w:rPr>
-                <w:rFonts w:ascii="BRH Devanagari Extra" w:hAnsi="BRH Devanagari Extra" w:cs="BRH Devanagari Extra"/>
-                <w:color w:val="000000"/>
-                <w:sz w:val="32"/>
-                <w:szCs w:val="40"/>
-              </w:rPr>
-              <w:t>-  E</w:t>
-            </w:r>
-            <w:proofErr w:type="gramEnd"/>
+              <w:t>)-  E</w:t>
+            </w:r>
             <w:r>
               <w:rPr>
                 <w:rFonts w:ascii="BRH Malayalam Extra" w:hAnsi="BRH Malayalam Extra" w:cs="BRH Devanagari Extra"/>
@@ -31343,19 +31713,8 @@
                 <w:sz w:val="32"/>
                 <w:szCs w:val="40"/>
               </w:rPr>
-              <w:t>)</w:t>
-            </w:r>
-            <w:proofErr w:type="gramStart"/>
-            <w:r>
-              <w:rPr>
-                <w:rFonts w:ascii="BRH Devanagari Extra" w:hAnsi="BRH Devanagari Extra" w:cs="BRH Devanagari Extra"/>
-                <w:color w:val="000000"/>
-                <w:sz w:val="32"/>
-                <w:szCs w:val="40"/>
-              </w:rPr>
-              <w:t>-  E</w:t>
-            </w:r>
-            <w:proofErr w:type="gramEnd"/>
+              <w:t>)-  E</w:t>
+            </w:r>
             <w:r>
               <w:rPr>
                 <w:rFonts w:ascii="BRH Malayalam Extra" w:hAnsi="BRH Malayalam Extra" w:cs="BRH Devanagari Extra"/>
@@ -31649,27 +32008,7 @@
                 <w:sz w:val="32"/>
                 <w:szCs w:val="40"/>
               </w:rPr>
-              <w:t>)</w:t>
-            </w:r>
-            <w:proofErr w:type="gramStart"/>
-            <w:r>
-              <w:rPr>
-                <w:rFonts w:ascii="BRH Devanagari Extra" w:hAnsi="BRH Devanagari Extra" w:cs="BRH Devanagari Extra"/>
-                <w:color w:val="000000"/>
-                <w:sz w:val="32"/>
-                <w:szCs w:val="40"/>
-              </w:rPr>
-              <w:t>-  AuÉþ</w:t>
-            </w:r>
-            <w:proofErr w:type="gramEnd"/>
-            <w:r>
-              <w:rPr>
-                <w:rFonts w:ascii="BRH Devanagari Extra" w:hAnsi="BRH Devanagari Extra" w:cs="BRH Devanagari Extra"/>
-                <w:color w:val="000000"/>
-                <w:sz w:val="32"/>
-                <w:szCs w:val="40"/>
-              </w:rPr>
-              <w:t xml:space="preserve"> | Â</w:t>
+              <w:t>)-  AuÉþ | Â</w:t>
             </w:r>
             <w:r>
               <w:rPr>
@@ -31997,19 +32336,8 @@
                 <w:sz w:val="32"/>
                 <w:szCs w:val="40"/>
               </w:rPr>
-              <w:t>)</w:t>
-            </w:r>
-            <w:proofErr w:type="gramStart"/>
-            <w:r>
-              <w:rPr>
-                <w:rFonts w:ascii="BRH Devanagari Extra" w:hAnsi="BRH Devanagari Extra" w:cs="BRH Devanagari Extra"/>
-                <w:color w:val="000000"/>
-                <w:sz w:val="32"/>
-                <w:szCs w:val="40"/>
-              </w:rPr>
-              <w:t>-  Â</w:t>
-            </w:r>
-            <w:proofErr w:type="gramEnd"/>
+              <w:t>)-  Â</w:t>
+            </w:r>
             <w:r>
               <w:rPr>
                 <w:rFonts w:ascii="BRH Malayalam Extra" w:hAnsi="BRH Malayalam Extra" w:cs="BRH Devanagari Extra"/>
@@ -32783,19 +33111,8 @@
                 <w:sz w:val="32"/>
                 <w:szCs w:val="40"/>
               </w:rPr>
-              <w:t>)</w:t>
-            </w:r>
-            <w:proofErr w:type="gramStart"/>
-            <w:r>
-              <w:rPr>
-                <w:rFonts w:ascii="BRH Devanagari Extra" w:hAnsi="BRH Devanagari Extra" w:cs="BRH Devanagari Extra"/>
-                <w:color w:val="000000"/>
-                <w:sz w:val="32"/>
-                <w:szCs w:val="40"/>
-              </w:rPr>
-              <w:t>-  SèurÉ</w:t>
-            </w:r>
-            <w:proofErr w:type="gramEnd"/>
+              <w:t>)-  SèurÉ</w:t>
+            </w:r>
             <w:r>
               <w:rPr>
                 <w:rFonts w:ascii="BRH Malayalam Extra" w:hAnsi="BRH Malayalam Extra" w:cs="BRH Devanagari Extra"/>
@@ -45308,27 +45625,7 @@
                 <w:sz w:val="32"/>
                 <w:szCs w:val="40"/>
               </w:rPr>
-              <w:t>)</w:t>
-            </w:r>
-            <w:proofErr w:type="gramStart"/>
-            <w:r>
-              <w:rPr>
-                <w:rFonts w:ascii="BRH Devanagari Extra" w:hAnsi="BRH Devanagari Extra" w:cs="BRH Devanagari Extra"/>
-                <w:color w:val="000000"/>
-                <w:sz w:val="32"/>
-                <w:szCs w:val="40"/>
-              </w:rPr>
-              <w:t>-  ÌWû</w:t>
-            </w:r>
-            <w:proofErr w:type="gramEnd"/>
-            <w:r>
-              <w:rPr>
-                <w:rFonts w:ascii="BRH Devanagari Extra" w:hAnsi="BRH Devanagari Extra" w:cs="BRH Devanagari Extra"/>
-                <w:color w:val="000000"/>
-                <w:sz w:val="32"/>
-                <w:szCs w:val="40"/>
-              </w:rPr>
-              <w:t xml:space="preserve"> | Så</w:t>
+              <w:t>)-  ÌWû | Så</w:t>
             </w:r>
             <w:r>
               <w:rPr>
@@ -45831,19 +46128,8 @@
                 <w:sz w:val="32"/>
                 <w:szCs w:val="40"/>
               </w:rPr>
-              <w:t>)</w:t>
-            </w:r>
-            <w:proofErr w:type="gramStart"/>
-            <w:r>
-              <w:rPr>
-                <w:rFonts w:ascii="BRH Devanagari Extra" w:hAnsi="BRH Devanagari Extra" w:cs="BRH Devanagari Extra"/>
-                <w:color w:val="000000"/>
-                <w:sz w:val="32"/>
-                <w:szCs w:val="40"/>
-              </w:rPr>
-              <w:t>-  Så</w:t>
-            </w:r>
-            <w:proofErr w:type="gramEnd"/>
+              <w:t>)-  Så</w:t>
+            </w:r>
             <w:r>
               <w:rPr>
                 <w:rFonts w:ascii="BRH Malayalam Extra" w:hAnsi="BRH Malayalam Extra" w:cs="BRH Devanagari Extra"/>
@@ -46135,7 +46421,6 @@
               </w:rPr>
               <w:t>(aqÉç)</w:t>
             </w:r>
-            <w:proofErr w:type="gramStart"/>
             <w:r>
               <w:rPr>
                 <w:rFonts w:ascii="BRH Malayalam Extra" w:hAnsi="BRH Malayalam Extra" w:cs="BRH Devanagari Extra"/>
@@ -46164,35 +46449,14 @@
               </w:rPr>
               <w:t>A</w:t>
             </w:r>
-            <w:proofErr w:type="gramEnd"/>
-            <w:r>
-              <w:rPr>
-                <w:rFonts w:ascii="BRH Devanagari Extra" w:hAnsi="BRH Devanagari Extra" w:cs="BRH Devanagari Extra"/>
-                <w:color w:val="000000"/>
-                <w:sz w:val="32"/>
-                <w:szCs w:val="40"/>
-              </w:rPr>
-              <w:t>µ</w:t>
-            </w:r>
-            <w:proofErr w:type="gramStart"/>
-            <w:r>
-              <w:rPr>
-                <w:rFonts w:ascii="BRH Devanagari Extra" w:hAnsi="BRH Devanagari Extra" w:cs="BRH Devanagari Extra"/>
-                <w:color w:val="000000"/>
-                <w:sz w:val="32"/>
-                <w:szCs w:val="40"/>
-              </w:rPr>
-              <w:t>ÉÉ(</w:t>
-            </w:r>
-            <w:proofErr w:type="gramEnd"/>
-            <w:r>
-              <w:rPr>
-                <w:rFonts w:ascii="BRH Devanagari Extra" w:hAnsi="BRH Devanagari Extra" w:cs="BRH Devanagari Extra"/>
-                <w:color w:val="000000"/>
-                <w:sz w:val="32"/>
-                <w:szCs w:val="40"/>
-              </w:rPr>
-              <w:t>aqÉç)þ AalÉå A</w:t>
+            <w:r>
+              <w:rPr>
+                <w:rFonts w:ascii="BRH Devanagari Extra" w:hAnsi="BRH Devanagari Extra" w:cs="BRH Devanagari Extra"/>
+                <w:color w:val="000000"/>
+                <w:sz w:val="32"/>
+                <w:szCs w:val="40"/>
+              </w:rPr>
+              <w:t>µÉÉ(aqÉç)þ AalÉå A</w:t>
             </w:r>
             <w:r>
               <w:rPr>
@@ -46308,27 +46572,7 @@
                 <w:sz w:val="32"/>
                 <w:szCs w:val="40"/>
               </w:rPr>
-              <w:t>µ</w:t>
-            </w:r>
-            <w:proofErr w:type="gramStart"/>
-            <w:r>
-              <w:rPr>
-                <w:rFonts w:ascii="BRH Devanagari Extra" w:hAnsi="BRH Devanagari Extra" w:cs="BRH Devanagari Extra"/>
-                <w:color w:val="000000"/>
-                <w:sz w:val="32"/>
-                <w:szCs w:val="40"/>
-              </w:rPr>
-              <w:t>ÉÉ(</w:t>
-            </w:r>
-            <w:proofErr w:type="gramEnd"/>
-            <w:r>
-              <w:rPr>
-                <w:rFonts w:ascii="BRH Devanagari Extra" w:hAnsi="BRH Devanagari Extra" w:cs="BRH Devanagari Extra"/>
-                <w:color w:val="000000"/>
-                <w:sz w:val="32"/>
-                <w:szCs w:val="40"/>
-              </w:rPr>
-              <w:t xml:space="preserve">aqÉç)þ AalÉå | </w:t>
+              <w:t xml:space="preserve">µÉÉ(aqÉç)þ AalÉå | </w:t>
             </w:r>
           </w:p>
         </w:tc>
@@ -46464,19 +46708,8 @@
                 <w:sz w:val="32"/>
                 <w:szCs w:val="40"/>
               </w:rPr>
-              <w:t>)</w:t>
-            </w:r>
-            <w:proofErr w:type="gramStart"/>
-            <w:r>
-              <w:rPr>
-                <w:rFonts w:ascii="BRH Devanagari Extra" w:hAnsi="BRH Devanagari Extra" w:cs="BRH Devanagari Extra"/>
-                <w:color w:val="000000"/>
-                <w:sz w:val="32"/>
-                <w:szCs w:val="40"/>
-              </w:rPr>
-              <w:t>-  G</w:t>
-            </w:r>
-            <w:proofErr w:type="gramEnd"/>
+              <w:t>)-  G</w:t>
+            </w:r>
             <w:r>
               <w:rPr>
                 <w:rFonts w:ascii="BRH Malayalam Extra" w:hAnsi="BRH Malayalam Extra" w:cs="BRH Devanagari Extra"/>
@@ -46800,19 +47033,8 @@
                 <w:sz w:val="32"/>
                 <w:szCs w:val="40"/>
               </w:rPr>
-              <w:t>)</w:t>
-            </w:r>
-            <w:proofErr w:type="gramStart"/>
-            <w:r>
-              <w:rPr>
-                <w:rFonts w:ascii="BRH Devanagari Extra" w:hAnsi="BRH Devanagari Extra" w:cs="BRH Devanagari Extra"/>
-                <w:color w:val="000000"/>
-                <w:sz w:val="32"/>
-                <w:szCs w:val="40"/>
-              </w:rPr>
-              <w:t>-  G</w:t>
-            </w:r>
-            <w:proofErr w:type="gramEnd"/>
+              <w:t>)-  G</w:t>
+            </w:r>
             <w:r>
               <w:rPr>
                 <w:rFonts w:ascii="BRH Malayalam Extra" w:hAnsi="BRH Malayalam Extra" w:cs="BRH Devanagari Extra"/>
@@ -47150,19 +47372,8 @@
                 <w:sz w:val="32"/>
                 <w:szCs w:val="40"/>
               </w:rPr>
-              <w:t>)</w:t>
-            </w:r>
-            <w:proofErr w:type="gramStart"/>
-            <w:r>
-              <w:rPr>
-                <w:rFonts w:ascii="BRH Devanagari Extra" w:hAnsi="BRH Devanagari Extra" w:cs="BRH Devanagari Extra"/>
-                <w:color w:val="000000"/>
-                <w:sz w:val="32"/>
-                <w:szCs w:val="40"/>
-              </w:rPr>
-              <w:t>-  C</w:t>
-            </w:r>
-            <w:proofErr w:type="gramEnd"/>
+              <w:t>)-  C</w:t>
+            </w:r>
             <w:r>
               <w:rPr>
                 <w:rFonts w:ascii="BRH Malayalam Extra" w:hAnsi="BRH Malayalam Extra" w:cs="BRH Devanagari Extra"/>
@@ -47401,19 +47612,8 @@
                 <w:sz w:val="32"/>
                 <w:szCs w:val="40"/>
               </w:rPr>
-              <w:t>)</w:t>
-            </w:r>
-            <w:proofErr w:type="gramStart"/>
-            <w:r>
-              <w:rPr>
-                <w:rFonts w:ascii="BRH Devanagari Extra" w:hAnsi="BRH Devanagari Extra" w:cs="BRH Devanagari Extra"/>
-                <w:color w:val="000000"/>
-                <w:sz w:val="32"/>
-                <w:szCs w:val="40"/>
-              </w:rPr>
-              <w:t>-  C</w:t>
-            </w:r>
-            <w:proofErr w:type="gramEnd"/>
+              <w:t>)-  C</w:t>
+            </w:r>
             <w:r>
               <w:rPr>
                 <w:rFonts w:ascii="BRH Malayalam Extra" w:hAnsi="BRH Malayalam Extra" w:cs="BRH Devanagari Extra"/>
@@ -47657,19 +47857,8 @@
                 <w:sz w:val="32"/>
                 <w:szCs w:val="40"/>
               </w:rPr>
-              <w:t>)</w:t>
-            </w:r>
-            <w:proofErr w:type="gramStart"/>
-            <w:r>
-              <w:rPr>
-                <w:rFonts w:ascii="BRH Devanagari Extra" w:hAnsi="BRH Devanagari Extra" w:cs="BRH Devanagari Extra"/>
-                <w:color w:val="000000"/>
-                <w:sz w:val="32"/>
-                <w:szCs w:val="40"/>
-              </w:rPr>
-              <w:t>-  C</w:t>
-            </w:r>
-            <w:proofErr w:type="gramEnd"/>
+              <w:t>)-  C</w:t>
+            </w:r>
             <w:r>
               <w:rPr>
                 <w:rFonts w:ascii="BRH Malayalam Extra" w:hAnsi="BRH Malayalam Extra" w:cs="BRH Devanagari Extra"/>
@@ -47923,19 +48112,8 @@
                 <w:sz w:val="32"/>
                 <w:szCs w:val="40"/>
               </w:rPr>
-              <w:t>)</w:t>
-            </w:r>
-            <w:proofErr w:type="gramStart"/>
-            <w:r>
-              <w:rPr>
-                <w:rFonts w:ascii="BRH Devanagari Extra" w:hAnsi="BRH Devanagari Extra" w:cs="BRH Devanagari Extra"/>
-                <w:color w:val="000000"/>
-                <w:sz w:val="32"/>
-                <w:szCs w:val="40"/>
-              </w:rPr>
-              <w:t>-  C</w:t>
-            </w:r>
-            <w:proofErr w:type="gramEnd"/>
+              <w:t>)-  C</w:t>
+            </w:r>
             <w:r>
               <w:rPr>
                 <w:rFonts w:ascii="BRH Malayalam Extra" w:hAnsi="BRH Malayalam Extra" w:cs="BRH Devanagari Extra"/>

</xml_diff>